<commit_message>
Changed Landing Page content, made texts shorter
</commit_message>
<xml_diff>
--- a/content/Litepaper.docx
+++ b/content/Litepaper.docx
@@ -152,7 +152,6 @@
           <w:szCs w:val="40"/>
         </w:rPr>
       </w:pPr>
-      <w:proofErr w:type="spellStart"/>
       <w:r>
         <w:rPr>
           <w:rFonts w:cstheme="minorHAnsi"/>
@@ -163,7 +162,6 @@
         </w:rPr>
         <w:t>Litepaper</w:t>
       </w:r>
-      <w:proofErr w:type="spellEnd"/>
     </w:p>
     <w:p>
       <w:pPr>
@@ -325,27 +323,11 @@
           <w:i/>
           <w:iCs/>
         </w:rPr>
-        <w:t xml:space="preserve">This </w:t>
-      </w:r>
-      <w:proofErr w:type="spellStart"/>
-      <w:r>
-        <w:rPr>
-          <w:i/>
-          <w:iCs/>
-        </w:rPr>
-        <w:t>Litepaper</w:t>
-      </w:r>
-      <w:proofErr w:type="spellEnd"/>
-      <w:r>
-        <w:rPr>
-          <w:i/>
-          <w:iCs/>
-        </w:rPr>
-        <w:t xml:space="preserve"> is for informational purposes only and does not constitute an offer to sell, a solicitation of an offer to buy, or a recommendation for any security or financial instrument. The information herein is not investment, legal, or tax advice. $RTD and $FIM are tokens with utility within the Ritardo Games ecosystem and are not intended to be investment products. Please conduct your own research and consult with professional advisors before participating. All forward-looking statements are subject to risks and uncertainties.</w:t>
-      </w:r>
-    </w:p>
-    <w:bookmarkStart w:id="0" w:name="_Toc205927073" w:displacedByCustomXml="next"/>
-    <w:bookmarkStart w:id="1" w:name="_Toc205985482" w:displacedByCustomXml="next"/>
+        <w:t>This Litepaper is for informational purposes only and does not constitute an offer to sell, a solicitation of an offer to buy, or a recommendation for any security or financial instrument. The information herein is not investment, legal, or tax advice. $RTD and $FIM are tokens with utility within the Ritardo Games ecosystem and are not intended to be investment products. Please conduct your own research and consult with professional advisors before participating. All forward-looking statements are subject to risks and uncertainties.</w:t>
+      </w:r>
+    </w:p>
+    <w:bookmarkStart w:id="0" w:name="_Toc205985482" w:displacedByCustomXml="next"/>
+    <w:bookmarkStart w:id="1" w:name="_Toc205927073" w:displacedByCustomXml="next"/>
     <w:sdt>
       <w:sdtPr>
         <w:rPr>
@@ -417,10 +399,10 @@
               <w:noProof/>
               <w:sz w:val="24"/>
               <w:szCs w:val="24"/>
-              <w:lang w:eastAsia="en-DE"/>
+              <w:lang w:val="en-DE" w:eastAsia="en-DE"/>
             </w:rPr>
           </w:pPr>
-          <w:hyperlink w:anchor="_Toc206418586" w:history="1">
+          <w:hyperlink w:anchor="_Toc216525211" w:history="1">
             <w:r>
               <w:rPr>
                 <w:rStyle w:val="Hyperlink"/>
@@ -436,7 +418,7 @@
                 <w:noProof/>
                 <w:sz w:val="24"/>
                 <w:szCs w:val="24"/>
-                <w:lang w:eastAsia="en-DE"/>
+                <w:lang w:val="en-DE" w:eastAsia="en-DE"/>
               </w:rPr>
               <w:tab/>
             </w:r>
@@ -467,7 +449,7 @@
                 <w:noProof/>
                 <w:webHidden/>
               </w:rPr>
-              <w:instrText xml:space="preserve"> PAGEREF _Toc206418586 \h </w:instrText>
+              <w:instrText xml:space="preserve"> PAGEREF _Toc216525211 \h </w:instrText>
             </w:r>
             <w:r>
               <w:rPr>
@@ -510,10 +492,10 @@
               <w:noProof/>
               <w:sz w:val="24"/>
               <w:szCs w:val="24"/>
-              <w:lang w:eastAsia="en-DE"/>
+              <w:lang w:val="en-DE" w:eastAsia="en-DE"/>
             </w:rPr>
           </w:pPr>
-          <w:hyperlink w:anchor="_Toc206418587" w:history="1">
+          <w:hyperlink w:anchor="_Toc216525212" w:history="1">
             <w:r>
               <w:rPr>
                 <w:rStyle w:val="Hyperlink"/>
@@ -528,7 +510,7 @@
                 <w:noProof/>
                 <w:sz w:val="24"/>
                 <w:szCs w:val="24"/>
-                <w:lang w:eastAsia="en-DE"/>
+                <w:lang w:val="en-DE" w:eastAsia="en-DE"/>
               </w:rPr>
               <w:tab/>
             </w:r>
@@ -558,7 +540,7 @@
                 <w:noProof/>
                 <w:webHidden/>
               </w:rPr>
-              <w:instrText xml:space="preserve"> PAGEREF _Toc206418587 \h </w:instrText>
+              <w:instrText xml:space="preserve"> PAGEREF _Toc216525212 \h </w:instrText>
             </w:r>
             <w:r>
               <w:rPr>
@@ -601,10 +583,10 @@
               <w:noProof/>
               <w:sz w:val="24"/>
               <w:szCs w:val="24"/>
-              <w:lang w:eastAsia="en-DE"/>
+              <w:lang w:val="en-DE" w:eastAsia="en-DE"/>
             </w:rPr>
           </w:pPr>
-          <w:hyperlink w:anchor="_Toc206418588" w:history="1">
+          <w:hyperlink w:anchor="_Toc216525213" w:history="1">
             <w:r>
               <w:rPr>
                 <w:rStyle w:val="Hyperlink"/>
@@ -619,7 +601,7 @@
                 <w:noProof/>
                 <w:sz w:val="24"/>
                 <w:szCs w:val="24"/>
-                <w:lang w:eastAsia="en-DE"/>
+                <w:lang w:val="en-DE" w:eastAsia="en-DE"/>
               </w:rPr>
               <w:tab/>
             </w:r>
@@ -649,7 +631,7 @@
                 <w:noProof/>
                 <w:webHidden/>
               </w:rPr>
-              <w:instrText xml:space="preserve"> PAGEREF _Toc206418588 \h </w:instrText>
+              <w:instrText xml:space="preserve"> PAGEREF _Toc216525213 \h </w:instrText>
             </w:r>
             <w:r>
               <w:rPr>
@@ -692,10 +674,10 @@
               <w:noProof/>
               <w:sz w:val="24"/>
               <w:szCs w:val="24"/>
-              <w:lang w:eastAsia="en-DE"/>
+              <w:lang w:val="en-DE" w:eastAsia="en-DE"/>
             </w:rPr>
           </w:pPr>
-          <w:hyperlink w:anchor="_Toc206418589" w:history="1">
+          <w:hyperlink w:anchor="_Toc216525214" w:history="1">
             <w:r>
               <w:rPr>
                 <w:rStyle w:val="Hyperlink"/>
@@ -710,7 +692,7 @@
                 <w:noProof/>
                 <w:sz w:val="24"/>
                 <w:szCs w:val="24"/>
-                <w:lang w:eastAsia="en-DE"/>
+                <w:lang w:val="en-DE" w:eastAsia="en-DE"/>
               </w:rPr>
               <w:tab/>
             </w:r>
@@ -740,7 +722,7 @@
                 <w:noProof/>
                 <w:webHidden/>
               </w:rPr>
-              <w:instrText xml:space="preserve"> PAGEREF _Toc206418589 \h </w:instrText>
+              <w:instrText xml:space="preserve"> PAGEREF _Toc216525214 \h </w:instrText>
             </w:r>
             <w:r>
               <w:rPr>
@@ -783,10 +765,10 @@
               <w:noProof/>
               <w:sz w:val="24"/>
               <w:szCs w:val="24"/>
-              <w:lang w:eastAsia="en-DE"/>
+              <w:lang w:val="en-DE" w:eastAsia="en-DE"/>
             </w:rPr>
           </w:pPr>
-          <w:hyperlink w:anchor="_Toc206418590" w:history="1">
+          <w:hyperlink w:anchor="_Toc216525215" w:history="1">
             <w:r>
               <w:rPr>
                 <w:rStyle w:val="Hyperlink"/>
@@ -801,7 +783,7 @@
                 <w:noProof/>
                 <w:sz w:val="24"/>
                 <w:szCs w:val="24"/>
-                <w:lang w:eastAsia="en-DE"/>
+                <w:lang w:val="en-DE" w:eastAsia="en-DE"/>
               </w:rPr>
               <w:tab/>
             </w:r>
@@ -831,7 +813,7 @@
                 <w:noProof/>
                 <w:webHidden/>
               </w:rPr>
-              <w:instrText xml:space="preserve"> PAGEREF _Toc206418590 \h </w:instrText>
+              <w:instrText xml:space="preserve"> PAGEREF _Toc216525215 \h </w:instrText>
             </w:r>
             <w:r>
               <w:rPr>
@@ -874,10 +856,10 @@
               <w:noProof/>
               <w:sz w:val="24"/>
               <w:szCs w:val="24"/>
-              <w:lang w:eastAsia="en-DE"/>
+              <w:lang w:val="en-DE" w:eastAsia="en-DE"/>
             </w:rPr>
           </w:pPr>
-          <w:hyperlink w:anchor="_Toc206418591" w:history="1">
+          <w:hyperlink w:anchor="_Toc216525216" w:history="1">
             <w:r>
               <w:rPr>
                 <w:rStyle w:val="Hyperlink"/>
@@ -892,7 +874,7 @@
                 <w:noProof/>
                 <w:sz w:val="24"/>
                 <w:szCs w:val="24"/>
-                <w:lang w:eastAsia="en-DE"/>
+                <w:lang w:val="en-DE" w:eastAsia="en-DE"/>
               </w:rPr>
               <w:tab/>
             </w:r>
@@ -922,7 +904,7 @@
                 <w:noProof/>
                 <w:webHidden/>
               </w:rPr>
-              <w:instrText xml:space="preserve"> PAGEREF _Toc206418591 \h </w:instrText>
+              <w:instrText xml:space="preserve"> PAGEREF _Toc216525216 \h </w:instrText>
             </w:r>
             <w:r>
               <w:rPr>
@@ -965,10 +947,10 @@
               <w:noProof/>
               <w:sz w:val="24"/>
               <w:szCs w:val="24"/>
-              <w:lang w:eastAsia="en-DE"/>
+              <w:lang w:val="en-DE" w:eastAsia="en-DE"/>
             </w:rPr>
           </w:pPr>
-          <w:hyperlink w:anchor="_Toc206418592" w:history="1">
+          <w:hyperlink w:anchor="_Toc216525217" w:history="1">
             <w:r>
               <w:rPr>
                 <w:rStyle w:val="Hyperlink"/>
@@ -983,7 +965,7 @@
                 <w:noProof/>
                 <w:sz w:val="24"/>
                 <w:szCs w:val="24"/>
-                <w:lang w:eastAsia="en-DE"/>
+                <w:lang w:val="en-DE" w:eastAsia="en-DE"/>
               </w:rPr>
               <w:tab/>
             </w:r>
@@ -1013,7 +995,7 @@
                 <w:noProof/>
                 <w:webHidden/>
               </w:rPr>
-              <w:instrText xml:space="preserve"> PAGEREF _Toc206418592 \h </w:instrText>
+              <w:instrText xml:space="preserve"> PAGEREF _Toc216525217 \h </w:instrText>
             </w:r>
             <w:r>
               <w:rPr>
@@ -1033,7 +1015,7 @@
                 <w:noProof/>
                 <w:webHidden/>
               </w:rPr>
-              <w:t>14</w:t>
+              <w:t>15</w:t>
             </w:r>
             <w:r>
               <w:rPr>
@@ -1056,10 +1038,10 @@
               <w:noProof/>
               <w:sz w:val="24"/>
               <w:szCs w:val="24"/>
-              <w:lang w:eastAsia="en-DE"/>
+              <w:lang w:val="en-DE" w:eastAsia="en-DE"/>
             </w:rPr>
           </w:pPr>
-          <w:hyperlink w:anchor="_Toc206418593" w:history="1">
+          <w:hyperlink w:anchor="_Toc216525218" w:history="1">
             <w:r>
               <w:rPr>
                 <w:rStyle w:val="Hyperlink"/>
@@ -1074,7 +1056,7 @@
                 <w:noProof/>
                 <w:sz w:val="24"/>
                 <w:szCs w:val="24"/>
-                <w:lang w:eastAsia="en-DE"/>
+                <w:lang w:val="en-DE" w:eastAsia="en-DE"/>
               </w:rPr>
               <w:tab/>
             </w:r>
@@ -1104,7 +1086,7 @@
                 <w:noProof/>
                 <w:webHidden/>
               </w:rPr>
-              <w:instrText xml:space="preserve"> PAGEREF _Toc206418593 \h </w:instrText>
+              <w:instrText xml:space="preserve"> PAGEREF _Toc216525218 \h </w:instrText>
             </w:r>
             <w:r>
               <w:rPr>
@@ -1124,7 +1106,7 @@
                 <w:noProof/>
                 <w:webHidden/>
               </w:rPr>
-              <w:t>15</w:t>
+              <w:t>16</w:t>
             </w:r>
             <w:r>
               <w:rPr>
@@ -1147,10 +1129,10 @@
               <w:noProof/>
               <w:sz w:val="24"/>
               <w:szCs w:val="24"/>
-              <w:lang w:eastAsia="en-DE"/>
+              <w:lang w:val="en-DE" w:eastAsia="en-DE"/>
             </w:rPr>
           </w:pPr>
-          <w:hyperlink w:anchor="_Toc206418594" w:history="1">
+          <w:hyperlink w:anchor="_Toc216525219" w:history="1">
             <w:r>
               <w:rPr>
                 <w:rStyle w:val="Hyperlink"/>
@@ -1166,7 +1148,7 @@
                 <w:noProof/>
                 <w:sz w:val="24"/>
                 <w:szCs w:val="24"/>
-                <w:lang w:eastAsia="en-DE"/>
+                <w:lang w:val="en-DE" w:eastAsia="en-DE"/>
               </w:rPr>
               <w:tab/>
             </w:r>
@@ -1197,7 +1179,7 @@
                 <w:noProof/>
                 <w:webHidden/>
               </w:rPr>
-              <w:instrText xml:space="preserve"> PAGEREF _Toc206418594 \h </w:instrText>
+              <w:instrText xml:space="preserve"> PAGEREF _Toc216525219 \h </w:instrText>
             </w:r>
             <w:r>
               <w:rPr>
@@ -1217,7 +1199,7 @@
                 <w:noProof/>
                 <w:webHidden/>
               </w:rPr>
-              <w:t>17</w:t>
+              <w:t>18</w:t>
             </w:r>
             <w:r>
               <w:rPr>
@@ -1240,10 +1222,10 @@
               <w:noProof/>
               <w:sz w:val="24"/>
               <w:szCs w:val="24"/>
-              <w:lang w:eastAsia="en-DE"/>
+              <w:lang w:val="en-DE" w:eastAsia="en-DE"/>
             </w:rPr>
           </w:pPr>
-          <w:hyperlink w:anchor="_Toc206418595" w:history="1">
+          <w:hyperlink w:anchor="_Toc216525220" w:history="1">
             <w:r>
               <w:rPr>
                 <w:rStyle w:val="Hyperlink"/>
@@ -1258,7 +1240,7 @@
                 <w:noProof/>
                 <w:sz w:val="24"/>
                 <w:szCs w:val="24"/>
-                <w:lang w:eastAsia="en-DE"/>
+                <w:lang w:val="en-DE" w:eastAsia="en-DE"/>
               </w:rPr>
               <w:tab/>
             </w:r>
@@ -1288,7 +1270,7 @@
                 <w:noProof/>
                 <w:webHidden/>
               </w:rPr>
-              <w:instrText xml:space="preserve"> PAGEREF _Toc206418595 \h </w:instrText>
+              <w:instrText xml:space="preserve"> PAGEREF _Toc216525220 \h </w:instrText>
             </w:r>
             <w:r>
               <w:rPr>
@@ -1308,7 +1290,7 @@
                 <w:noProof/>
                 <w:webHidden/>
               </w:rPr>
-              <w:t>18</w:t>
+              <w:t>19</w:t>
             </w:r>
             <w:r>
               <w:rPr>
@@ -1331,10 +1313,10 @@
               <w:noProof/>
               <w:sz w:val="24"/>
               <w:szCs w:val="24"/>
-              <w:lang w:eastAsia="en-DE"/>
+              <w:lang w:val="en-DE" w:eastAsia="en-DE"/>
             </w:rPr>
           </w:pPr>
-          <w:hyperlink w:anchor="_Toc206418596" w:history="1">
+          <w:hyperlink w:anchor="_Toc216525221" w:history="1">
             <w:r>
               <w:rPr>
                 <w:rStyle w:val="Hyperlink"/>
@@ -1349,7 +1331,7 @@
                 <w:noProof/>
                 <w:sz w:val="24"/>
                 <w:szCs w:val="24"/>
-                <w:lang w:eastAsia="en-DE"/>
+                <w:lang w:val="en-DE" w:eastAsia="en-DE"/>
               </w:rPr>
               <w:tab/>
             </w:r>
@@ -1358,7 +1340,21 @@
                 <w:rStyle w:val="Hyperlink"/>
                 <w:noProof/>
               </w:rPr>
-              <w:t>Join the Game</w:t>
+              <w:t>Join t</w:t>
+            </w:r>
+            <w:r>
+              <w:rPr>
+                <w:rStyle w:val="Hyperlink"/>
+                <w:noProof/>
+              </w:rPr>
+              <w:t>h</w:t>
+            </w:r>
+            <w:r>
+              <w:rPr>
+                <w:rStyle w:val="Hyperlink"/>
+                <w:noProof/>
+              </w:rPr>
+              <w:t>e Game</w:t>
             </w:r>
             <w:r>
               <w:rPr>
@@ -1379,7 +1375,7 @@
                 <w:noProof/>
                 <w:webHidden/>
               </w:rPr>
-              <w:instrText xml:space="preserve"> PAGEREF _Toc206418596 \h </w:instrText>
+              <w:instrText xml:space="preserve"> PAGEREF _Toc216525221 \h </w:instrText>
             </w:r>
             <w:r>
               <w:rPr>
@@ -1399,7 +1395,7 @@
                 <w:noProof/>
                 <w:webHidden/>
               </w:rPr>
-              <w:t>19</w:t>
+              <w:t>20</w:t>
             </w:r>
             <w:r>
               <w:rPr>
@@ -1463,7 +1459,7 @@
         </w:rPr>
       </w:pPr>
       <w:bookmarkStart w:id="2" w:name="_Toc205984799"/>
-      <w:bookmarkStart w:id="3" w:name="_Toc206418586"/>
+      <w:bookmarkStart w:id="3" w:name="_Toc216525211"/>
       <w:r>
         <w:rPr>
           <w:rFonts w:cstheme="minorHAnsi"/>
@@ -1484,34 +1480,37 @@
       <w:r>
         <w:rPr>
           <w:rFonts w:cstheme="minorHAnsi"/>
-        </w:rPr>
-        <w:t>Mission: Ritardo Games is a decentralized strategy game built to settle the oldest debate in economics. We are transforming the rigged game of speculative trading into a fair, transparent, and provably skill-based contest between Capitalism and Socialism, fought on-chain.</w:t>
-      </w:r>
-    </w:p>
-    <w:p>
-      <w:pPr>
+          <w:b/>
+          <w:bCs/>
+        </w:rPr>
+        <w:t>Mission: </w:t>
+      </w:r>
+      <w:r>
         <w:rPr>
           <w:rFonts w:cstheme="minorHAnsi"/>
         </w:rPr>
-      </w:pPr>
-      <w:r>
+        <w:t>Ritardo Games is a decentralized strategy game built to settle the oldest debate in economics. We are transforming the rigged game of speculative trading into a fair, transparent, and provably skill-based contest between Capitalism and Socialism, fought on-chain.</w:t>
+      </w:r>
+    </w:p>
+    <w:p>
+      <w:pPr>
         <w:rPr>
           <w:rFonts w:cstheme="minorHAnsi"/>
         </w:rPr>
-        <w:t>The Problem: The battle between the informed few and the hopeful many is as old as markets themselves. The decentralized financial ecosystem has accelerated this timeless dynamic to an extreme, creating a system where asymmetric information is weaponized to systematically turn retail participants into exit liquidity.</w:t>
-      </w:r>
-    </w:p>
-    <w:p>
-      <w:pPr>
+      </w:pPr>
+      <w:r>
         <w:rPr>
           <w:rFonts w:cstheme="minorHAnsi"/>
-        </w:rPr>
-      </w:pPr>
+          <w:b/>
+          <w:bCs/>
+        </w:rPr>
+        <w:t>The Problem:</w:t>
+      </w:r>
       <w:r>
         <w:rPr>
           <w:rFonts w:cstheme="minorHAnsi"/>
         </w:rPr>
-        <w:t>Our Solution: We've built a perfect-information strategy game where collective action battles economic power for real-money stakes. The Ritardo Games ecosystem is powered by a sophisticated dual-token model that separates gameplay from governance and is engineered with unique mechanics to ensure a level playing field.</w:t>
+        <w:t> The battle between the informed few and the hopeful many is as old as markets themselves. The decentralized financial ecosystem has accelerated this timeless dynamic to an extreme, creating a system where asymmetric information is weaponized to systematically turn retail participants into exit liquidity.</w:t>
       </w:r>
     </w:p>
     <w:p>
@@ -1523,6 +1522,31 @@
       <w:r>
         <w:rPr>
           <w:rFonts w:cstheme="minorHAnsi"/>
+          <w:b/>
+          <w:bCs/>
+        </w:rPr>
+        <w:t>Our Solution:</w:t>
+      </w:r>
+      <w:r>
+        <w:rPr>
+          <w:rFonts w:cstheme="minorHAnsi"/>
+        </w:rPr>
+        <w:t> We've built a perfect-information strategy game where collective action battles economic power for real-money stakes. The Ritardo Games ecosystem is powered by a sophisticated dual-token model that separates gameplay from governance and is engineered with unique mechanics to ensure a level playing field.</w:t>
+      </w:r>
+    </w:p>
+    <w:p>
+      <w:pPr>
+        <w:rPr>
+          <w:rFonts w:cstheme="minorHAnsi"/>
+          <w:b/>
+          <w:bCs/>
+        </w:rPr>
+      </w:pPr>
+      <w:r>
+        <w:rPr>
+          <w:rFonts w:cstheme="minorHAnsi"/>
+          <w:b/>
+          <w:bCs/>
         </w:rPr>
         <w:t>The Ecosystem:</w:t>
       </w:r>
@@ -1540,8 +1564,50 @@
       <w:r>
         <w:rPr>
           <w:rFonts w:cstheme="minorHAnsi"/>
-        </w:rPr>
-        <w:t>Gameplay Token ($FIM - Fake Internet Money): Each season, players mint a new, non-transferable $FIM token by committing USDC in a Batch Auction, which fairly prices the token and forms the Prize Pool. For one quarter, players trade $FIM on a buy-side only exchange—a strategic marketplace designed to prevent manipulation—to influence the game's Gini Coefficient.</w:t>
+          <w:b/>
+          <w:bCs/>
+        </w:rPr>
+        <w:t>Gameplay Token ($FIM - Fake Internet Money):</w:t>
+      </w:r>
+      <w:r>
+        <w:rPr>
+          <w:rFonts w:cstheme="minorHAnsi"/>
+        </w:rPr>
+        <w:t> </w:t>
+      </w:r>
+      <w:r>
+        <w:rPr>
+          <w:rFonts w:cstheme="minorHAnsi"/>
+        </w:rPr>
+        <w:t> Each season, players mint a new, non-transferable $FIM token by committing USDC in a </w:t>
+      </w:r>
+      <w:r>
+        <w:rPr>
+          <w:rFonts w:cstheme="minorHAnsi"/>
+          <w:b/>
+          <w:bCs/>
+        </w:rPr>
+        <w:t>Batch Auction</w:t>
+      </w:r>
+      <w:r>
+        <w:rPr>
+          <w:rFonts w:cstheme="minorHAnsi"/>
+        </w:rPr>
+        <w:t>, which fairly prices the token and forms the Prize Pool. For one quarter, players trade $FIM on a unique </w:t>
+      </w:r>
+      <w:r>
+        <w:rPr>
+          <w:rFonts w:cstheme="minorHAnsi"/>
+          <w:b/>
+          <w:bCs/>
+        </w:rPr>
+        <w:t>Asymmetric "No-Par" Exchange</w:t>
+      </w:r>
+      <w:r>
+        <w:rPr>
+          <w:rFonts w:cstheme="minorHAnsi"/>
+        </w:rPr>
+        <w:t>—a strategic marketplace designed to prevent manipulation—to influence the game's Gini Coefficient.</w:t>
       </w:r>
     </w:p>
     <w:p>
@@ -1557,13 +1623,34 @@
       <w:r>
         <w:rPr>
           <w:rFonts w:cstheme="minorHAnsi"/>
-        </w:rPr>
-        <w:t>Governance Token ($RTD - Ritardo): This is the DAO's ownership token. Holders of $RTD govern the entire ecosystem, from the rules of the game to the management of the treasury.</w:t>
-      </w:r>
-    </w:p>
-    <w:p>
-      <w:pPr>
-        <w:pStyle w:val="ListParagraph"/>
+          <w:b/>
+          <w:bCs/>
+        </w:rPr>
+        <w:t>Governance Token ($RTD - Ritardo): </w:t>
+      </w:r>
+      <w:r>
+        <w:rPr>
+          <w:rFonts w:cstheme="minorHAnsi"/>
+        </w:rPr>
+        <w:t>This is the DAO's ownership token. Holders of $RTD govern the entire ecosystem through </w:t>
+      </w:r>
+      <w:r>
+        <w:rPr>
+          <w:rFonts w:cstheme="minorHAnsi"/>
+          <w:b/>
+          <w:bCs/>
+        </w:rPr>
+        <w:t>gasless voting on Snapshot</w:t>
+      </w:r>
+      <w:r>
+        <w:rPr>
+          <w:rFonts w:cstheme="minorHAnsi"/>
+        </w:rPr>
+        <w:t>, ensuring every voice can be heard without friction.</w:t>
+      </w:r>
+    </w:p>
+    <w:p>
+      <w:pPr>
         <w:numPr>
           <w:ilvl w:val="0"/>
           <w:numId w:val="35"/>
@@ -1575,21 +1662,59 @@
       <w:r>
         <w:rPr>
           <w:rFonts w:cstheme="minorHAnsi"/>
-        </w:rPr>
-        <w:t>Victory &amp; Payout: Victory is achieved when one ideology is the first to shift the Gini Coefficient a set amount toward its goal (perfect inequality for Capitalism, or perfect equality for Socialism). The Prize Pool is then distributed according to the winning philosophy: a winner-take-all "Oligarchy" payout or a redistributive "Solidarity Fund" payout.</w:t>
-      </w:r>
-    </w:p>
-    <w:p>
-      <w:pPr>
+          <w:b/>
+          <w:bCs/>
+        </w:rPr>
+        <w:t xml:space="preserve">Victory &amp; Payout: </w:t>
+      </w:r>
+      <w:r>
         <w:rPr>
           <w:rFonts w:cstheme="minorHAnsi"/>
         </w:rPr>
-      </w:pPr>
-      <w:r>
+        <w:t>Victory is achieved when one ideology is the first to shift the Gini Coefficient a set amount toward its goal (perfect inequality for Capitalism, or perfect equality for Socialism). The Prize Pool is then distributed according to the winning philosophy: a winner-take-all "Oligarchy" payout or a redistributive "Solidarity Fund" payout.</w:t>
+      </w:r>
+    </w:p>
+    <w:p>
+      <w:pPr>
         <w:rPr>
           <w:rFonts w:cstheme="minorHAnsi"/>
         </w:rPr>
-        <w:t>Sustainable Yield for Governors: The USDC in the Prize Pool is not idle. It is deployed into blue-chip DeFi protocols to generate a stable yield. This yield—the DAO's revenue—is distributed to staked $RTD holders as a continuous stream, rewarding long-term governors with a sustainable return and eliminating the volatility of discrete "dividend" events.</w:t>
+      </w:pPr>
+      <w:r>
+        <w:rPr>
+          <w:rFonts w:cstheme="minorHAnsi"/>
+          <w:b/>
+          <w:bCs/>
+        </w:rPr>
+        <w:t>Sustainable Yield for Governors: </w:t>
+      </w:r>
+      <w:r>
+        <w:rPr>
+          <w:rFonts w:cstheme="minorHAnsi"/>
+          <w:b/>
+          <w:bCs/>
+        </w:rPr>
+        <w:t>T</w:t>
+      </w:r>
+      <w:r>
+        <w:rPr>
+          <w:rFonts w:cstheme="minorHAnsi"/>
+        </w:rPr>
+        <w:t>he USDC in the Prize Pool is deployed to generate a stable yield, which is streamed continuously to staked $RTD holders. This is combined with a </w:t>
+      </w:r>
+      <w:r>
+        <w:rPr>
+          <w:rFonts w:cstheme="minorHAnsi"/>
+          <w:b/>
+          <w:bCs/>
+        </w:rPr>
+        <w:t>frictionless governance system</w:t>
+      </w:r>
+      <w:r>
+        <w:rPr>
+          <w:rFonts w:cstheme="minorHAnsi"/>
+        </w:rPr>
+        <w:t>, where all voting is free, making the DAO truly accessible to everyone. The on-chain execution of passed votes is handled by a trusted, community-controlled Execution Council.</w:t>
       </w:r>
     </w:p>
     <w:p/>
@@ -1618,7 +1743,7 @@
           <w:b w:val="0"/>
         </w:rPr>
       </w:pPr>
-      <w:bookmarkStart w:id="5" w:name="_Toc206418587"/>
+      <w:bookmarkStart w:id="5" w:name="_Toc216525212"/>
       <w:r>
         <w:lastRenderedPageBreak/>
         <w:t>DAO Overview &amp; Core Principles</w:t>
@@ -1672,7 +1797,29 @@
       </w:r>
       <w:r>
         <w:br/>
-        <w:t>Our ecosystem uses a dual structure for maximum protection and credible neutrality: a Swiss non-profit Foundation to act as a legal steward, and the Ritardo Games DAO, the fully on-chain, player-governed game engine.</w:t>
+      </w:r>
+      <w:r>
+        <w:t>Our ecosystem uses a dual structure for maximum protection and credible neutrality. The core of the DAO is a </w:t>
+      </w:r>
+      <w:r>
+        <w:rPr>
+          <w:b/>
+          <w:bCs/>
+        </w:rPr>
+        <w:t>gasless governance system on Snapshot</w:t>
+      </w:r>
+      <w:r>
+        <w:t>, where all $RTD holders can vote for free. The on-chain execution of passed proposals is handled by a community-controlled multi-signature wallet, </w:t>
+      </w:r>
+      <w:r>
+        <w:rPr>
+          <w:b/>
+          <w:bCs/>
+        </w:rPr>
+        <w:t>The Execution Council</w:t>
+      </w:r>
+      <w:r>
+        <w:t>, which acts as the trusted hand of the DAO. This entire system is stewarded by a Swiss non-profit Foundation.</w:t>
       </w:r>
     </w:p>
     <w:tbl>
@@ -1897,7 +2044,19 @@
                     <w:rPr>
                       <w:rFonts w:cstheme="minorHAnsi"/>
                     </w:rPr>
-                    <w:t>Executes all decisions via on-chain voting by $RTD holders.</w:t>
+                    <w:t xml:space="preserve">Executes all decisions via </w:t>
+                  </w:r>
+                  <w:r>
+                    <w:rPr>
+                      <w:rFonts w:cstheme="minorHAnsi"/>
+                    </w:rPr>
+                    <w:t>free off-chain</w:t>
+                  </w:r>
+                  <w:r>
+                    <w:rPr>
+                      <w:rFonts w:cstheme="minorHAnsi"/>
+                    </w:rPr>
+                    <w:t xml:space="preserve"> voting by $RTD holders.</w:t>
                   </w:r>
                 </w:p>
               </w:tc>
@@ -2095,6 +2254,7 @@
     </w:p>
     <w:p>
       <w:pPr>
+        <w:pStyle w:val="ListParagraph"/>
         <w:numPr>
           <w:ilvl w:val="0"/>
           <w:numId w:val="24"/>
@@ -2105,10 +2265,14 @@
           <w:b/>
           <w:bCs/>
         </w:rPr>
-        <w:t>Sustainable Governance:</w:t>
-      </w:r>
-      <w:r>
-        <w:t xml:space="preserve"> DAO ownership is productive. Our governors earn a real, continuous yield generated by the game's core activity.</w:t>
+        <w:t>Accessible &amp; Sustainable Governance</w:t>
+      </w:r>
+      <w:r>
+        <w:t xml:space="preserve">: DAO ownership should be productive and participation should be frictionless. Our governors earn a real, continuous yield, and all </w:t>
+      </w:r>
+      <w:r>
+        <w:lastRenderedPageBreak/>
+        <w:t>voting is conducted gas-free via Snapshot, ensuring that every voice can be heard, regardless of the size of their wallet.</w:t>
       </w:r>
     </w:p>
     <w:p>
@@ -2141,9 +2305,8 @@
         </w:rPr>
       </w:pPr>
       <w:bookmarkStart w:id="6" w:name="_Toc205984801"/>
-      <w:bookmarkStart w:id="7" w:name="_Toc206418588"/>
-      <w:r>
-        <w:lastRenderedPageBreak/>
+      <w:bookmarkStart w:id="7" w:name="_Toc216525213"/>
+      <w:r>
         <w:t>Market Opportunity &amp; Competitive Landscape</w:t>
       </w:r>
       <w:bookmarkEnd w:id="6"/>
@@ -2369,23 +2532,7 @@
           <w:b/>
           <w:bCs/>
         </w:rPr>
-        <w:t>The Crypto Gaming (</w:t>
-      </w:r>
-      <w:proofErr w:type="spellStart"/>
-      <w:r>
-        <w:rPr>
-          <w:b/>
-          <w:bCs/>
-        </w:rPr>
-        <w:t>GameFi</w:t>
-      </w:r>
-      <w:proofErr w:type="spellEnd"/>
-      <w:r>
-        <w:rPr>
-          <w:b/>
-          <w:bCs/>
-        </w:rPr>
-        <w:t>) Market:</w:t>
+        <w:t>The Crypto Gaming (GameFi) Market:</w:t>
       </w:r>
     </w:p>
     <w:p>
@@ -2403,15 +2550,7 @@
         <w:t>Market Size:</w:t>
       </w:r>
       <w:r>
-        <w:t xml:space="preserve"> With millions of active wallets and billions of dollars in on-chain assets, </w:t>
-      </w:r>
-      <w:proofErr w:type="spellStart"/>
-      <w:r>
-        <w:t>GameFi</w:t>
-      </w:r>
-      <w:proofErr w:type="spellEnd"/>
-      <w:r>
-        <w:t xml:space="preserve"> has proven the demand for player-owned economies.</w:t>
+        <w:t> With millions of active wallets and billions of dollars in on-chain assets, GameFi has proven the demand for player-owned economies.</w:t>
       </w:r>
     </w:p>
     <w:p>
@@ -2426,18 +2565,11 @@
           <w:b/>
           <w:bCs/>
         </w:rPr>
+        <w:lastRenderedPageBreak/>
         <w:t>Our Appeal:</w:t>
       </w:r>
       <w:r>
-        <w:t xml:space="preserve"> Ritardo Games represents the evolution of </w:t>
-      </w:r>
-      <w:proofErr w:type="spellStart"/>
-      <w:r>
-        <w:t>GameFi</w:t>
-      </w:r>
-      <w:proofErr w:type="spellEnd"/>
-      <w:r>
-        <w:t>. We move beyond the repetitive "grinding" mechanics of early titles and offer a game of pure, high-level economic strategy.</w:t>
+        <w:t> Ritardo Games represents the evolution of GameFi. We move beyond the repetitive "grinding" mechanics of early titles and offer a game of pure, high-level economic strategy.</w:t>
       </w:r>
     </w:p>
     <w:p>
@@ -2457,7 +2589,6 @@
     </w:p>
     <w:p>
       <w:r>
-        <w:lastRenderedPageBreak/>
         <w:t>Ritardo Games is a first-of-its-kind platform, creating a new category of "Economic Strategy Game." As such, </w:t>
       </w:r>
       <w:r>
@@ -2764,16 +2895,8 @@
               <w:rPr>
                 <w:rFonts w:cstheme="minorHAnsi"/>
               </w:rPr>
-              <w:t xml:space="preserve">Luck, Hype &amp; Social </w:t>
-            </w:r>
-            <w:proofErr w:type="spellStart"/>
-            <w:r>
-              <w:rPr>
-                <w:rFonts w:cstheme="minorHAnsi"/>
-              </w:rPr>
-              <w:t>Signaling</w:t>
-            </w:r>
-            <w:proofErr w:type="spellEnd"/>
+              <w:t>Luck, Hype &amp; Social Signaling</w:t>
+            </w:r>
           </w:p>
         </w:tc>
         <w:tc>
@@ -3112,7 +3235,7 @@
           <w:b w:val="0"/>
         </w:rPr>
       </w:pPr>
-      <w:bookmarkStart w:id="9" w:name="_Toc206418589"/>
+      <w:bookmarkStart w:id="9" w:name="_Toc216525214"/>
       <w:r>
         <w:lastRenderedPageBreak/>
         <w:t>Technology Stack</w:t>
@@ -3173,15 +3296,7 @@
         <w:t>Low Transaction Costs:</w:t>
       </w:r>
       <w:r>
-        <w:t xml:space="preserve"> As a Layer 2, Base offers significantly lower gas fees than the Ethereum </w:t>
-      </w:r>
-      <w:proofErr w:type="spellStart"/>
-      <w:r>
-        <w:t>mainnet</w:t>
-      </w:r>
-      <w:proofErr w:type="spellEnd"/>
-      <w:r>
-        <w:t>. This is critical for our game, which encourages active trading, making it affordable and accessible for all players.</w:t>
+        <w:t> As a Layer 2, Base offers significantly lower gas fees than the Ethereum mainnet. This is critical for our game, which encourages active trading, making it affordable and accessible for all players.</w:t>
       </w:r>
     </w:p>
     <w:p>
@@ -3217,15 +3332,7 @@
         <w:t>Ethereum Security:</w:t>
       </w:r>
       <w:r>
-        <w:t xml:space="preserve"> Base inherits the robust security and decentralization of the Ethereum </w:t>
-      </w:r>
-      <w:proofErr w:type="spellStart"/>
-      <w:r>
-        <w:t>mainnet</w:t>
-      </w:r>
-      <w:proofErr w:type="spellEnd"/>
-      <w:r>
-        <w:t>, ensuring that our players' assets and the DAO's treasury are fundamentally secure.</w:t>
+        <w:t> Base inherits the robust security and decentralization of the Ethereum mainnet, ensuring that our players' assets and the DAO's treasury are fundamentally secure.</w:t>
       </w:r>
     </w:p>
     <w:p/>
@@ -3252,7 +3359,7 @@
           <w:numId w:val="31"/>
         </w:numPr>
       </w:pPr>
-      <w:bookmarkStart w:id="11" w:name="_Toc206418590"/>
+      <w:bookmarkStart w:id="11" w:name="_Toc216525215"/>
       <w:r>
         <w:lastRenderedPageBreak/>
         <w:t>The Game: Rules &amp; Mechanics</w:t>
@@ -3422,24 +3529,14 @@
     </w:p>
     <w:p>
       <w:r>
-        <w:t>The game's trading occurs on a transparent, </w:t>
-      </w:r>
-      <w:r>
-        <w:rPr>
-          <w:b/>
-          <w:bCs/>
-        </w:rPr>
-        <w:t>buy-side only order book.</w:t>
-      </w:r>
-      <w:r>
-        <w:t> This is a fundamental pillar of the game's fairness and strategic depth.</w:t>
+        <w:t>The game's trading occurs on a transparent and strategically unique marketplace. This is not a standard exchange; it is the core of the game's "Gini-aware" strategy.</w:t>
       </w:r>
     </w:p>
     <w:p>
       <w:pPr>
         <w:numPr>
           <w:ilvl w:val="0"/>
-          <w:numId w:val="38"/>
+          <w:numId w:val="44"/>
         </w:numPr>
       </w:pPr>
       <w:r>
@@ -3447,17 +3544,17 @@
           <w:b/>
           <w:bCs/>
         </w:rPr>
-        <w:t>Mechanism:</w:t>
-      </w:r>
-      <w:r>
-        <w:t> Players who want to buy $FIM must post a public buy order with their USDC. Players who want to sell $FIM must choose an existing buy order to fill.</w:t>
+        <w:t>The Core Rule:</w:t>
+      </w:r>
+      <w:r>
+        <w:t> Players cannot trade at a neutral "par" value (1.0 USDC). A mandatory, non-tradeable "spread" is enforced, the size of which is a governable parameter.</w:t>
       </w:r>
     </w:p>
     <w:p>
       <w:pPr>
         <w:numPr>
           <w:ilvl w:val="0"/>
-          <w:numId w:val="38"/>
+          <w:numId w:val="44"/>
         </w:numPr>
       </w:pPr>
       <w:r>
@@ -3465,30 +3562,117 @@
           <w:b/>
           <w:bCs/>
         </w:rPr>
-        <w:t>Strategic Impact:</w:t>
-      </w:r>
-      <w:r>
-        <w:t> This prevents risk-free manipulation by forcing any player wishing to acquire tokens into an open, competitive market. It also enables deep </w:t>
-      </w:r>
-      <w:r>
-        <w:rPr>
-          <w:b/>
-          <w:bCs/>
-        </w:rPr>
-        <w:t>"Gini-aware" gameplay</w:t>
-      </w:r>
-      <w:r>
-        <w:t>, where sellers can choose </w:t>
+        <w:t>The Two Actions:</w:t>
+      </w:r>
+    </w:p>
+    <w:p>
+      <w:pPr>
+        <w:numPr>
+          <w:ilvl w:val="1"/>
+          <w:numId w:val="44"/>
+        </w:numPr>
+      </w:pPr>
+      <w:r>
+        <w:rPr>
+          <w:b/>
+          <w:bCs/>
+        </w:rPr>
+        <w:t>To Buy $FIM</w:t>
+      </w:r>
+      <w:r>
+        <w:rPr>
+          <w:b/>
+          <w:bCs/>
+        </w:rPr>
+        <w:t xml:space="preserve">: </w:t>
+      </w:r>
+      <w:r>
+        <w:t>You must post a public </w:t>
+      </w:r>
+      <w:r>
+        <w:rPr>
+          <w:b/>
+          <w:bCs/>
+        </w:rPr>
+        <w:t>BUY order at a premium</w:t>
+      </w:r>
+      <w:r>
+        <w:t> (e.g., &gt;1.0</w:t>
+      </w:r>
+      <w:r>
+        <w:t>00</w:t>
+      </w:r>
+      <w:r>
+        <w:t>1 USDC).</w:t>
+      </w:r>
+    </w:p>
+    <w:p>
+      <w:pPr>
+        <w:numPr>
+          <w:ilvl w:val="1"/>
+          <w:numId w:val="44"/>
+        </w:numPr>
+      </w:pPr>
+      <w:r>
+        <w:rPr>
+          <w:b/>
+          <w:bCs/>
+        </w:rPr>
+        <w:t>To Sell $FIM</w:t>
+      </w:r>
+      <w:r>
+        <w:rPr>
+          <w:b/>
+          <w:bCs/>
+        </w:rPr>
+        <w:t>:</w:t>
+      </w:r>
+      <w:r>
+        <w:t> You must post a public </w:t>
+      </w:r>
+      <w:r>
+        <w:rPr>
+          <w:b/>
+          <w:bCs/>
+        </w:rPr>
+        <w:t>SELL order at a discount</w:t>
+      </w:r>
+      <w:r>
+        <w:t> (e.g., &lt;0.99</w:t>
+      </w:r>
+      <w:r>
+        <w:t>99</w:t>
+      </w:r>
+      <w:r>
+        <w:t xml:space="preserve"> USDC).</w:t>
+      </w:r>
+    </w:p>
+    <w:p>
+      <w:pPr>
+        <w:numPr>
+          <w:ilvl w:val="0"/>
+          <w:numId w:val="44"/>
+        </w:numPr>
+      </w:pPr>
+      <w:r>
+        <w:rPr>
+          <w:b/>
+          <w:bCs/>
+        </w:rPr>
+        <w:t>The Strategic Impact:</w:t>
+      </w:r>
+      <w:r>
+        <w:t> This design is a powerful security feature that makes risk-free Gini manipulation impossible. It forces every single trade to be a public, ideological, and strategic choice. It also enables deep gameplay where players can see the token balances of their potential counterparties, making </w:t>
       </w:r>
       <w:r>
         <w:rPr>
           <w:i/>
           <w:iCs/>
         </w:rPr>
-        <w:t>which</w:t>
-      </w:r>
-      <w:r>
-        <w:t> buyer to sell to based not just on price, but on the strategic impact the trade will have on the Gini Coefficient.</w:t>
+        <w:t>who</w:t>
+      </w:r>
+      <w:r>
+        <w:t> you trade with as important as the price.</w:t>
       </w:r>
     </w:p>
     <w:p>
@@ -3519,15 +3703,7 @@
         </w:numPr>
       </w:pPr>
       <w:r>
-        <w:t>Initial State (</w:t>
-      </w:r>
-      <w:proofErr w:type="spellStart"/>
-      <w:r>
-        <w:t>G_initial</w:t>
-      </w:r>
-      <w:proofErr w:type="spellEnd"/>
-      <w:r>
-        <w:t>): The Gini Coefficient calculated at the moment the Auction ends. This is the starting line for the race.</w:t>
+        <w:t>Initial State (G_initial): The Gini Coefficient calculated at the moment the Auction ends. This is the starting line for the race.</w:t>
       </w:r>
     </w:p>
     <w:p>
@@ -3538,36 +3714,13 @@
         </w:numPr>
       </w:pPr>
       <w:r>
+        <w:lastRenderedPageBreak/>
         <w:t>Victory Threshold: A fixed score of 0.25 (representing 25% progress).</w:t>
       </w:r>
     </w:p>
     <w:p>
       <w:r>
-        <w:t>The Capitalist Faction Wins If: (</w:t>
-      </w:r>
-      <w:proofErr w:type="spellStart"/>
-      <w:r>
-        <w:t>G_current</w:t>
-      </w:r>
-      <w:proofErr w:type="spellEnd"/>
-      <w:r>
-        <w:t xml:space="preserve"> - </w:t>
-      </w:r>
-      <w:proofErr w:type="spellStart"/>
-      <w:r>
-        <w:t>G_initial</w:t>
-      </w:r>
-      <w:proofErr w:type="spellEnd"/>
-      <w:r>
-        <w:t xml:space="preserve">) / (1 - </w:t>
-      </w:r>
-      <w:proofErr w:type="spellStart"/>
-      <w:r>
-        <w:t>G_initial</w:t>
-      </w:r>
-      <w:proofErr w:type="spellEnd"/>
-      <w:r>
-        <w:t>) ≥ 0.25</w:t>
+        <w:t>The Capitalist Faction Wins If: (G_current - G_initial) / (1 - G_initial) ≥ 0.25</w:t>
       </w:r>
     </w:p>
     <w:p>
@@ -3578,40 +3731,7 @@
         </w:numPr>
       </w:pPr>
       <w:r>
-        <w:lastRenderedPageBreak/>
-        <w:t xml:space="preserve">Explanation: The denominator (1 - </w:t>
-      </w:r>
-      <w:proofErr w:type="spellStart"/>
-      <w:r>
-        <w:t>G_initial</w:t>
-      </w:r>
-      <w:proofErr w:type="spellEnd"/>
-      <w:r>
-        <w:t>) represents the total "distance" left to travel to reach perfect inequality (a Gini of 1.0). The numerator (</w:t>
-      </w:r>
-      <w:proofErr w:type="spellStart"/>
-      <w:r>
-        <w:t>G_current</w:t>
-      </w:r>
-      <w:proofErr w:type="spellEnd"/>
-      <w:r>
-        <w:t xml:space="preserve"> - </w:t>
-      </w:r>
-      <w:proofErr w:type="spellStart"/>
-      <w:r>
-        <w:t>G_initial</w:t>
-      </w:r>
-      <w:proofErr w:type="spellEnd"/>
-      <w:r>
-        <w:t xml:space="preserve">) is the distance already </w:t>
-      </w:r>
-      <w:proofErr w:type="spellStart"/>
-      <w:r>
-        <w:t>traveled</w:t>
-      </w:r>
-      <w:proofErr w:type="spellEnd"/>
-      <w:r>
-        <w:t>. This formula calculates the exact percentage of the remaining path that the Capitalists have successfully covered.</w:t>
+        <w:t>Explanation: The denominator (1 - G_initial) represents the total "distance" left to travel to reach perfect inequality (a Gini of 1.0). The numerator (G_current - G_initial) is the distance already traveled. This formula calculates the exact percentage of the remaining path that the Capitalists have successfully covered.</w:t>
       </w:r>
     </w:p>
     <w:p>
@@ -3622,52 +3742,12 @@
         </w:numPr>
       </w:pPr>
       <w:r>
-        <w:t>Example: If </w:t>
-      </w:r>
-      <w:proofErr w:type="spellStart"/>
-      <w:r>
-        <w:t>G_initial</w:t>
-      </w:r>
-      <w:proofErr w:type="spellEnd"/>
-      <w:r>
-        <w:t> is 0.80, the remaining distance to 1.0 is 0.20. To win, the Capitalists must increase the Gini by 25% of that distance, meaning </w:t>
-      </w:r>
-      <w:proofErr w:type="spellStart"/>
-      <w:r>
-        <w:t>G_current</w:t>
-      </w:r>
-      <w:proofErr w:type="spellEnd"/>
-      <w:r>
-        <w:t> must reach at least 0.85.</w:t>
-      </w:r>
-    </w:p>
-    <w:p>
-      <w:r>
-        <w:t>The Socialist Faction Wins If: ((</w:t>
-      </w:r>
-      <w:proofErr w:type="spellStart"/>
-      <w:r>
-        <w:t>G_initial</w:t>
-      </w:r>
-      <w:proofErr w:type="spellEnd"/>
-      <w:r>
-        <w:t xml:space="preserve"> - </w:t>
-      </w:r>
-      <w:proofErr w:type="spellStart"/>
-      <w:r>
-        <w:t>G_current</w:t>
-      </w:r>
-      <w:proofErr w:type="spellEnd"/>
-      <w:r>
-        <w:t xml:space="preserve">) / </w:t>
-      </w:r>
-      <w:proofErr w:type="spellStart"/>
-      <w:r>
-        <w:t>G_initial</w:t>
-      </w:r>
-      <w:proofErr w:type="spellEnd"/>
-      <w:r>
-        <w:t>) * M ≥ 0.25</w:t>
+        <w:t>Example: If G_initial is 0.80, the remaining distance to 1.0 is 0.20. To win, the Capitalists must increase the Gini by 25% of that distance, meaning G_current must reach at least 0.85.</w:t>
+      </w:r>
+    </w:p>
+    <w:p>
+      <w:r>
+        <w:t>The Socialist Faction Wins If: ((G_initial - G_current) / G_initial) * M ≥ 0.25</w:t>
       </w:r>
     </w:p>
     <w:p>
@@ -3678,31 +3758,7 @@
         </w:numPr>
       </w:pPr>
       <w:r>
-        <w:t>Explanation: Similarly, the denominator (</w:t>
-      </w:r>
-      <w:proofErr w:type="spellStart"/>
-      <w:r>
-        <w:t>G_initial</w:t>
-      </w:r>
-      <w:proofErr w:type="spellEnd"/>
-      <w:r>
-        <w:t>) represents the total distance to travel to reach perfect equality (a Gini of 0.0). The numerator (</w:t>
-      </w:r>
-      <w:proofErr w:type="spellStart"/>
-      <w:r>
-        <w:t>G_initial</w:t>
-      </w:r>
-      <w:proofErr w:type="spellEnd"/>
-      <w:r>
-        <w:t xml:space="preserve"> - </w:t>
-      </w:r>
-      <w:proofErr w:type="spellStart"/>
-      <w:r>
-        <w:t>G_current</w:t>
-      </w:r>
-      <w:proofErr w:type="spellEnd"/>
-      <w:r>
-        <w:t>) is the distance already covered. This formula calculates the percentage of that path the Socialists have covered, which is then boosted by the Compensation Multiplier.</w:t>
+        <w:t>Explanation: Similarly, the denominator (G_initial) represents the total distance to travel to reach perfect equality (a Gini of 0.0). The numerator (G_initial - G_current) is the distance already covered. This formula calculates the percentage of that path the Socialists have covered, which is then boosted by the Compensation Multiplier.</w:t>
       </w:r>
     </w:p>
     <w:p>
@@ -3713,23 +3769,7 @@
         </w:numPr>
       </w:pPr>
       <w:r>
-        <w:t>Example: If </w:t>
-      </w:r>
-      <w:proofErr w:type="spellStart"/>
-      <w:r>
-        <w:t>G_initial</w:t>
-      </w:r>
-      <w:proofErr w:type="spellEnd"/>
-      <w:r>
-        <w:t> is 0.50, the Socialists must reduce the Gini by 25% of that distance, meaning </w:t>
-      </w:r>
-      <w:proofErr w:type="spellStart"/>
-      <w:r>
-        <w:t>G_current</w:t>
-      </w:r>
-      <w:proofErr w:type="spellEnd"/>
-      <w:r>
-        <w:t> must fall to 0.375 (before the multiplier is applied).</w:t>
+        <w:t>Example: If G_initial is 0.50, the Socialists must reduce the Gini by 25% of that distance, meaning G_current must fall to 0.375 (before the multiplier is applied).</w:t>
       </w:r>
     </w:p>
     <w:p>
@@ -3749,23 +3789,7 @@
     </w:p>
     <w:p>
       <w:r>
-        <w:t xml:space="preserve">M = 1.4 + (1 - </w:t>
-      </w:r>
-      <w:proofErr w:type="spellStart"/>
-      <w:r>
-        <w:t>G_</w:t>
-      </w:r>
-      <w:proofErr w:type="gramStart"/>
-      <w:r>
-        <w:t>initial</w:t>
-      </w:r>
-      <w:proofErr w:type="spellEnd"/>
-      <w:r>
-        <w:t>)^</w:t>
-      </w:r>
-      <w:proofErr w:type="gramEnd"/>
-      <w:r>
-        <w:t>2</w:t>
+        <w:t>M = 1.4 + (1 - G_initial)^2</w:t>
       </w:r>
     </w:p>
     <w:p>
@@ -3823,15 +3847,7 @@
         </w:numPr>
       </w:pPr>
       <w:r>
-        <w:t xml:space="preserve">The smallest group of top players </w:t>
-      </w:r>
-      <w:proofErr w:type="gramStart"/>
-      <w:r>
-        <w:t>whose</w:t>
-      </w:r>
-      <w:proofErr w:type="gramEnd"/>
-      <w:r>
-        <w:t xml:space="preserve"> combined $FIM holdings equal or exceed 50% of the total supply is identified as the "Oligarchy."</w:t>
+        <w:t>The smallest group of top players whose combined $FIM holdings equal or exceed 50% of the total supply is identified as the "Oligarchy."</w:t>
       </w:r>
     </w:p>
     <w:p>
@@ -3842,6 +3858,7 @@
         </w:numPr>
       </w:pPr>
       <w:r>
+        <w:lastRenderedPageBreak/>
         <w:t>This Oligarchy splits 100% of the prize pool proportional to their individual $FIM holdings within the group.</w:t>
       </w:r>
     </w:p>
@@ -3858,7 +3875,6 @@
     </w:p>
     <w:p>
       <w:r>
-        <w:lastRenderedPageBreak/>
         <w:t>If Socialism Wins: The Solidarity Fund</w:t>
       </w:r>
     </w:p>
@@ -3914,15 +3930,7 @@
         </w:numPr>
       </w:pPr>
       <w:r>
-        <w:t>A </w:t>
-      </w:r>
-      <w:proofErr w:type="spellStart"/>
-      <w:r>
-        <w:t>Cap_Value</w:t>
-      </w:r>
-      <w:proofErr w:type="spellEnd"/>
-      <w:r>
-        <w:t> is established, equal to the theoretical prize share of the richest player within the "Masses" group.</w:t>
+        <w:t>A Cap_Value is established, equal to the theoretical prize share of the richest player within the "Masses" group.</w:t>
       </w:r>
     </w:p>
     <w:p>
@@ -3933,15 +3941,7 @@
         </w:numPr>
       </w:pPr>
       <w:r>
-        <w:t>Any "Elite" player whose theoretical share exceeds this cap has their payout reduced to the </w:t>
-      </w:r>
-      <w:proofErr w:type="spellStart"/>
-      <w:r>
-        <w:t>Cap_Value</w:t>
-      </w:r>
-      <w:proofErr w:type="spellEnd"/>
-      <w:r>
-        <w:t>.</w:t>
+        <w:t>Any "Elite" player whose theoretical share exceeds this cap has their payout reduced to the Cap_Value.</w:t>
       </w:r>
     </w:p>
     <w:p>
@@ -3963,23 +3963,7 @@
         </w:numPr>
       </w:pPr>
       <w:r>
-        <w:t>This fund is then distributed among ALL players (both Masses and Elite) based on their proportional Net Contribution (</w:t>
-      </w:r>
-      <w:proofErr w:type="spellStart"/>
-      <w:r>
-        <w:t>Money_In</w:t>
-      </w:r>
-      <w:proofErr w:type="spellEnd"/>
-      <w:r>
-        <w:t xml:space="preserve"> - </w:t>
-      </w:r>
-      <w:proofErr w:type="spellStart"/>
-      <w:r>
-        <w:t>Money_Out</w:t>
-      </w:r>
-      <w:proofErr w:type="spellEnd"/>
-      <w:r>
-        <w:t>). This is a Sybil-resistant metric that rewards players who risked the most personal capital during the game, regardless of their final token count</w:t>
+        <w:t>This fund is then distributed among ALL players (both Masses and Elite) based on their proportional Net Contribution (Money_In - Money_Out). This is a Sybil-resistant metric that rewards players who risked the most personal capital during the game, regardless of their final token count</w:t>
       </w:r>
     </w:p>
     <w:p/>
@@ -4006,15 +3990,10 @@
           <w:numId w:val="31"/>
         </w:numPr>
       </w:pPr>
-      <w:bookmarkStart w:id="13" w:name="_Toc206418591"/>
-      <w:proofErr w:type="spellStart"/>
+      <w:bookmarkStart w:id="13" w:name="_Toc216525216"/>
       <w:r>
         <w:lastRenderedPageBreak/>
-        <w:t>Tokenomics</w:t>
-      </w:r>
-      <w:proofErr w:type="spellEnd"/>
-      <w:r>
-        <w:t xml:space="preserve"> &amp; Governance</w:t>
+        <w:t>Tokenomics &amp; Governance</w:t>
       </w:r>
       <w:bookmarkEnd w:id="12"/>
       <w:bookmarkEnd w:id="13"/>
@@ -4125,10 +4104,10 @@
           <w:b/>
           <w:bCs/>
         </w:rPr>
-        <w:t>Core Utility: Governance</w:t>
-      </w:r>
-      <w:r>
-        <w:t>. $RDT holders propose and vote on all critical parameters:</w:t>
+        <w:t xml:space="preserve">Core Utility: Gasless Governance. </w:t>
+      </w:r>
+      <w:r>
+        <w:t>Staked and liquid $RTD tokens represent voting power in the Ritardo Games Snapshot space. Holders can create proposals and vote—entirely for free—on all critical parameters of the ecosystem, including:</w:t>
       </w:r>
     </w:p>
     <w:p>
@@ -4139,7 +4118,7 @@
         </w:numPr>
       </w:pPr>
       <w:r>
-        <w:t>Game rules (Victory Threshold, Multiplier formula, etc.).</w:t>
+        <w:t>The rules and financial strategy for upcoming game seasons.</w:t>
       </w:r>
     </w:p>
     <w:p>
@@ -4150,7 +4129,7 @@
         </w:numPr>
       </w:pPr>
       <w:r>
-        <w:t>Whitelist of DeFi protocols for yield generation.</w:t>
+        <w:t>The members of the Execution Council who enact the DAO's will on-chain.</w:t>
       </w:r>
     </w:p>
     <w:p>
@@ -4161,7 +4140,25 @@
         </w:numPr>
       </w:pPr>
       <w:r>
-        <w:t>DAO treasury management and spending.</w:t>
+        <w:t>Management and spending of the DAO's Community Treasury.</w:t>
+      </w:r>
+    </w:p>
+    <w:p>
+      <w:pPr>
+        <w:numPr>
+          <w:ilvl w:val="0"/>
+          <w:numId w:val="9"/>
+        </w:numPr>
+      </w:pPr>
+      <w:r>
+        <w:rPr>
+          <w:b/>
+          <w:bCs/>
+        </w:rPr>
+        <w:t>Value Accrual: Continuous Yield Stream</w:t>
+      </w:r>
+      <w:r>
+        <w:t>. This is the cornerstone of $RTD's value. The system is designed to provide a continuous, flowing stream of rewards to long-term stakers.</w:t>
       </w:r>
     </w:p>
     <w:p>
@@ -4172,7 +4169,39 @@
         </w:numPr>
       </w:pPr>
       <w:r>
-        <w:t>New game modes and feature development.</w:t>
+        <w:t>At the end of each season, the total USDC yield is harvested from the Prize Pool.</w:t>
+      </w:r>
+    </w:p>
+    <w:p>
+      <w:pPr>
+        <w:numPr>
+          <w:ilvl w:val="1"/>
+          <w:numId w:val="9"/>
+        </w:numPr>
+      </w:pPr>
+      <w:r>
+        <w:t xml:space="preserve">This yield is then made available to staked $RTD holders not all at once, but as a </w:t>
+      </w:r>
+      <w:r>
+        <w:rPr>
+          <w:b/>
+          <w:bCs/>
+        </w:rPr>
+        <w:t>continuous stream</w:t>
+      </w:r>
+      <w:r>
+        <w:t>, released with every block that passes during the following season.</w:t>
+      </w:r>
+    </w:p>
+    <w:p>
+      <w:pPr>
+        <w:numPr>
+          <w:ilvl w:val="1"/>
+          <w:numId w:val="9"/>
+        </w:numPr>
+      </w:pPr>
+      <w:r>
+        <w:t>This model eliminates the price volatility of "dividend" events and directly rewards the most committed, long-term governors of the protocol.</w:t>
       </w:r>
     </w:p>
     <w:p>
@@ -4183,30 +4212,7 @@
         </w:numPr>
       </w:pPr>
       <w:r>
-        <w:rPr>
-          <w:b/>
-          <w:bCs/>
-        </w:rPr>
-        <w:t>Value Accrual: Continuous Yield Stream</w:t>
-      </w:r>
-      <w:r>
-        <w:t>. This is the cornerstone of $</w:t>
-      </w:r>
-      <w:proofErr w:type="spellStart"/>
-      <w:r>
-        <w:t>RTD's</w:t>
-      </w:r>
-      <w:proofErr w:type="spellEnd"/>
-      <w:r>
-        <w:t xml:space="preserve"> value. The system is designed to provide a continuous, flowing stream of rewards to long-term </w:t>
-      </w:r>
-      <w:proofErr w:type="spellStart"/>
-      <w:r>
-        <w:t>stakers</w:t>
-      </w:r>
-      <w:proofErr w:type="spellEnd"/>
-      <w:r>
-        <w:t>.</w:t>
+        <w:t>The Flywheel Effect:</w:t>
       </w:r>
     </w:p>
     <w:p>
@@ -4217,7 +4223,7 @@
         </w:numPr>
       </w:pPr>
       <w:r>
-        <w:t>At the end of each season, the total USDC yield is harvested from the Prize Pool.</w:t>
+        <w:t>More players lead to a larger Prize Pool.</w:t>
       </w:r>
     </w:p>
     <w:p>
@@ -4228,17 +4234,7 @@
         </w:numPr>
       </w:pPr>
       <w:r>
-        <w:t xml:space="preserve">This yield is then made available to staked $RTD holders not all at once, but as a </w:t>
-      </w:r>
-      <w:r>
-        <w:rPr>
-          <w:b/>
-          <w:bCs/>
-        </w:rPr>
-        <w:t>continuous stream</w:t>
-      </w:r>
-      <w:r>
-        <w:t>, released with every block that passes during the following season.</w:t>
+        <w:t>A larger Prize Pool generates more yield.</w:t>
       </w:r>
     </w:p>
     <w:p>
@@ -4249,59 +4245,7 @@
         </w:numPr>
       </w:pPr>
       <w:r>
-        <w:t>This model eliminates the price volatility of "dividend" events and directly rewards the most committed, long-term governors of the protocol.</w:t>
-      </w:r>
-    </w:p>
-    <w:p>
-      <w:pPr>
-        <w:numPr>
-          <w:ilvl w:val="0"/>
-          <w:numId w:val="9"/>
-        </w:numPr>
-      </w:pPr>
-      <w:r>
-        <w:t>The Flywheel Effect:</w:t>
-      </w:r>
-    </w:p>
-    <w:p>
-      <w:pPr>
-        <w:numPr>
-          <w:ilvl w:val="1"/>
-          <w:numId w:val="9"/>
-        </w:numPr>
-      </w:pPr>
-      <w:r>
-        <w:t>More players lead to a larger Prize Pool.</w:t>
-      </w:r>
-    </w:p>
-    <w:p>
-      <w:pPr>
-        <w:numPr>
-          <w:ilvl w:val="1"/>
-          <w:numId w:val="9"/>
-        </w:numPr>
-      </w:pPr>
-      <w:r>
-        <w:t>A larger Prize Pool generates more yield.</w:t>
-      </w:r>
-    </w:p>
-    <w:p>
-      <w:pPr>
-        <w:numPr>
-          <w:ilvl w:val="1"/>
-          <w:numId w:val="9"/>
-        </w:numPr>
-      </w:pPr>
-      <w:r>
-        <w:t>More yield increases the rewards for $RDT </w:t>
-      </w:r>
-      <w:proofErr w:type="spellStart"/>
-      <w:r>
-        <w:t>stakers</w:t>
-      </w:r>
-      <w:proofErr w:type="spellEnd"/>
-      <w:r>
-        <w:t>.</w:t>
+        <w:t>More yield increases the rewards for $RDT stakers.</w:t>
       </w:r>
     </w:p>
     <w:p>
@@ -4679,15 +4623,7 @@
           </w:tcPr>
           <w:p>
             <w:r>
-              <w:t xml:space="preserve">To bootstrap the initial community of governors and players. A significant portion will be airdropped to early </w:t>
-            </w:r>
-            <w:proofErr w:type="spellStart"/>
-            <w:r>
-              <w:t>testnet</w:t>
-            </w:r>
-            <w:proofErr w:type="spellEnd"/>
-            <w:r>
-              <w:t xml:space="preserve"> participants and community members, with the remainder used to provide initial liquidity on decentralized exchanges.</w:t>
+              <w:t>To bootstrap the initial community of governors and players. A significant portion will be airdropped to early testnet participants and community members, with the remainder used to provide initial liquidity on decentralized exchanges.</w:t>
             </w:r>
           </w:p>
         </w:tc>
@@ -4749,41 +4685,23 @@
         <w:rPr>
           <w:b/>
           <w:bCs/>
-          <w:lang w:val="en-DE"/>
-        </w:rPr>
-      </w:pPr>
-      <w:r>
-        <w:rPr>
-          <w:b/>
-          <w:bCs/>
-          <w:lang w:val="en-DE"/>
+        </w:rPr>
+      </w:pPr>
+      <w:r>
+        <w:rPr>
+          <w:b/>
+          <w:bCs/>
         </w:rPr>
         <w:t>The Genesis Airdrop: Earning Your Stake</w:t>
       </w:r>
     </w:p>
     <w:p>
-      <w:pPr>
-        <w:rPr>
-          <w:lang w:val="en-DE"/>
-        </w:rPr>
-      </w:pPr>
-      <w:r>
-        <w:rPr>
-          <w:lang w:val="en-DE"/>
-        </w:rPr>
+      <w:r>
         <w:t>The initial public distribution of $RTD is not a simple giveaway; it is the first game of our ecosystem. Our Genesis Airdrop is a meritocratic program designed to reward the true contributors who help build this project from the ground up.</w:t>
       </w:r>
     </w:p>
     <w:p>
-      <w:pPr>
-        <w:rPr>
-          <w:lang w:val="en-DE"/>
-        </w:rPr>
-      </w:pPr>
-      <w:r>
-        <w:rPr>
-          <w:lang w:val="en-DE"/>
-        </w:rPr>
+      <w:r>
         <w:lastRenderedPageBreak/>
         <w:t>Your allocation will be determined by a Contribution Score, ensuring that the most valuable founding members receive a proportional stake in the DAO. While the full, detailed formula is available in our Whitepaper, here are the four key paths to earning your share:</w:t>
       </w:r>
@@ -4793,14 +4711,12 @@
         <w:rPr>
           <w:b/>
           <w:bCs/>
-          <w:lang w:val="en-DE"/>
-        </w:rPr>
-      </w:pPr>
-      <w:r>
-        <w:rPr>
-          <w:b/>
-          <w:bCs/>
-          <w:lang w:val="en-DE"/>
+        </w:rPr>
+      </w:pPr>
+      <w:r>
+        <w:rPr>
+          <w:b/>
+          <w:bCs/>
         </w:rPr>
         <w:t>1. Community &amp; Social Engagement:</w:t>
       </w:r>
@@ -4811,22 +4727,15 @@
           <w:ilvl w:val="0"/>
           <w:numId w:val="40"/>
         </w:numPr>
-        <w:rPr>
-          <w:lang w:val="en-DE"/>
-        </w:rPr>
-      </w:pPr>
-      <w:r>
-        <w:rPr>
-          <w:b/>
-          <w:bCs/>
-          <w:lang w:val="en-DE"/>
+      </w:pPr>
+      <w:r>
+        <w:rPr>
+          <w:b/>
+          <w:bCs/>
         </w:rPr>
         <w:t>Action:</w:t>
       </w:r>
       <w:r>
-        <w:rPr>
-          <w:lang w:val="en-DE"/>
-        </w:rPr>
         <w:t> Join the community, participate in strategic discussions, and help create a vibrant atmosphere.</w:t>
       </w:r>
     </w:p>
@@ -4836,22 +4745,15 @@
           <w:ilvl w:val="0"/>
           <w:numId w:val="40"/>
         </w:numPr>
-        <w:rPr>
-          <w:lang w:val="en-DE"/>
-        </w:rPr>
-      </w:pPr>
-      <w:r>
-        <w:rPr>
-          <w:b/>
-          <w:bCs/>
-          <w:lang w:val="en-DE"/>
+      </w:pPr>
+      <w:r>
+        <w:rPr>
+          <w:b/>
+          <w:bCs/>
         </w:rPr>
         <w:t>Reward:</w:t>
       </w:r>
       <w:r>
-        <w:rPr>
-          <w:lang w:val="en-DE"/>
-        </w:rPr>
         <w:t> Earn a base score for joining and a multiplier for being a valued, constructive member.</w:t>
       </w:r>
     </w:p>
@@ -4860,14 +4762,12 @@
         <w:rPr>
           <w:b/>
           <w:bCs/>
-          <w:lang w:val="en-DE"/>
-        </w:rPr>
-      </w:pPr>
-      <w:r>
-        <w:rPr>
-          <w:b/>
-          <w:bCs/>
-          <w:lang w:val="en-DE"/>
+        </w:rPr>
+      </w:pPr>
+      <w:r>
+        <w:rPr>
+          <w:b/>
+          <w:bCs/>
         </w:rPr>
         <w:t>2. Ecosystem Growth (Referrals):</w:t>
       </w:r>
@@ -4878,22 +4778,15 @@
           <w:ilvl w:val="0"/>
           <w:numId w:val="41"/>
         </w:numPr>
-        <w:rPr>
-          <w:lang w:val="en-DE"/>
-        </w:rPr>
-      </w:pPr>
-      <w:r>
-        <w:rPr>
-          <w:b/>
-          <w:bCs/>
-          <w:lang w:val="en-DE"/>
+      </w:pPr>
+      <w:r>
+        <w:rPr>
+          <w:b/>
+          <w:bCs/>
         </w:rPr>
         <w:t>Action:</w:t>
       </w:r>
       <w:r>
-        <w:rPr>
-          <w:lang w:val="en-DE"/>
-        </w:rPr>
         <w:t> Share your unique code to bring other high-quality strategists and players into the community.</w:t>
       </w:r>
     </w:p>
@@ -4903,72 +4796,31 @@
           <w:ilvl w:val="0"/>
           <w:numId w:val="41"/>
         </w:numPr>
-        <w:rPr>
-          <w:lang w:val="en-DE"/>
-        </w:rPr>
-      </w:pPr>
-      <w:r>
-        <w:rPr>
-          <w:b/>
-          <w:bCs/>
-          <w:lang w:val="en-DE"/>
+      </w:pPr>
+      <w:r>
+        <w:rPr>
+          <w:b/>
+          <w:bCs/>
         </w:rPr>
         <w:t>Reward:</w:t>
       </w:r>
       <w:r>
-        <w:rPr>
-          <w:lang w:val="en-DE"/>
-        </w:rPr>
-        <w:t xml:space="preserve"> Earn points for every successful referral who actively participates in the </w:t>
-      </w:r>
-      <w:proofErr w:type="spellStart"/>
-      <w:r>
-        <w:rPr>
-          <w:lang w:val="en-DE"/>
-        </w:rPr>
-        <w:t>Testnet</w:t>
-      </w:r>
-      <w:proofErr w:type="spellEnd"/>
-      <w:r>
-        <w:rPr>
-          <w:lang w:val="en-DE"/>
-        </w:rPr>
-        <w:t>, with a diminishing returns system to reward quality over quantity.</w:t>
-      </w:r>
-    </w:p>
-    <w:p>
-      <w:pPr>
-        <w:rPr>
-          <w:b/>
-          <w:bCs/>
-          <w:lang w:val="en-DE"/>
-        </w:rPr>
-      </w:pPr>
-      <w:r>
-        <w:rPr>
-          <w:b/>
-          <w:bCs/>
-          <w:lang w:val="en-DE"/>
-        </w:rPr>
-        <w:t xml:space="preserve">3. </w:t>
-      </w:r>
-      <w:proofErr w:type="spellStart"/>
-      <w:r>
-        <w:rPr>
-          <w:b/>
-          <w:bCs/>
-          <w:lang w:val="en-DE"/>
-        </w:rPr>
-        <w:t>Testnet</w:t>
-      </w:r>
-      <w:proofErr w:type="spellEnd"/>
-      <w:r>
-        <w:rPr>
-          <w:b/>
-          <w:bCs/>
-          <w:lang w:val="en-DE"/>
-        </w:rPr>
-        <w:t xml:space="preserve"> Performance (Highest Weight):</w:t>
+        <w:t> Earn points for every successful referral who actively participates in the Testnet, with a diminishing returns system to reward quality over quantity.</w:t>
+      </w:r>
+    </w:p>
+    <w:p>
+      <w:pPr>
+        <w:rPr>
+          <w:b/>
+          <w:bCs/>
+        </w:rPr>
+      </w:pPr>
+      <w:r>
+        <w:rPr>
+          <w:b/>
+          <w:bCs/>
+        </w:rPr>
+        <w:t>3. Testnet Performance (Highest Weight):</w:t>
       </w:r>
     </w:p>
     <w:p>
@@ -4977,37 +4829,16 @@
           <w:ilvl w:val="0"/>
           <w:numId w:val="42"/>
         </w:numPr>
-        <w:rPr>
-          <w:lang w:val="en-DE"/>
-        </w:rPr>
-      </w:pPr>
-      <w:r>
-        <w:rPr>
-          <w:b/>
-          <w:bCs/>
-          <w:lang w:val="en-DE"/>
+      </w:pPr>
+      <w:r>
+        <w:rPr>
+          <w:b/>
+          <w:bCs/>
         </w:rPr>
         <w:t>Action:</w:t>
       </w:r>
       <w:r>
-        <w:rPr>
-          <w:lang w:val="en-DE"/>
-        </w:rPr>
-        <w:t xml:space="preserve"> This is the ultimate proof of value. Participate in our scarcity-based </w:t>
-      </w:r>
-      <w:proofErr w:type="spellStart"/>
-      <w:r>
-        <w:rPr>
-          <w:lang w:val="en-DE"/>
-        </w:rPr>
-        <w:t>Testnet</w:t>
-      </w:r>
-      <w:proofErr w:type="spellEnd"/>
-      <w:r>
-        <w:rPr>
-          <w:lang w:val="en-DE"/>
-        </w:rPr>
-        <w:t>, where every player starts with a randomized amount of capital.</w:t>
+        <w:t> This is the ultimate proof of value. Participate in our scarcity-based Testnet, where every player starts with a randomized amount of capital.</w:t>
       </w:r>
     </w:p>
     <w:p>
@@ -5016,22 +4847,15 @@
           <w:ilvl w:val="0"/>
           <w:numId w:val="42"/>
         </w:numPr>
-        <w:rPr>
-          <w:lang w:val="en-DE"/>
-        </w:rPr>
-      </w:pPr>
-      <w:r>
-        <w:rPr>
-          <w:b/>
-          <w:bCs/>
-          <w:lang w:val="en-DE"/>
+      </w:pPr>
+      <w:r>
+        <w:rPr>
+          <w:b/>
+          <w:bCs/>
         </w:rPr>
         <w:t>Reward:</w:t>
       </w:r>
       <w:r>
-        <w:rPr>
-          <w:lang w:val="en-DE"/>
-        </w:rPr>
         <w:t> The most significant portion of your score will come from your performance. You are rewarded for being active and, most importantly, for being on the winning faction. Skill on the battlefield is the key to a large allocation.</w:t>
       </w:r>
     </w:p>
@@ -5040,14 +4864,12 @@
         <w:rPr>
           <w:b/>
           <w:bCs/>
-          <w:lang w:val="en-DE"/>
-        </w:rPr>
-      </w:pPr>
-      <w:r>
-        <w:rPr>
-          <w:b/>
-          <w:bCs/>
-          <w:lang w:val="en-DE"/>
+        </w:rPr>
+      </w:pPr>
+      <w:r>
+        <w:rPr>
+          <w:b/>
+          <w:bCs/>
         </w:rPr>
         <w:t>4. Protocol Security (Bug Bounties):</w:t>
       </w:r>
@@ -5058,22 +4880,15 @@
           <w:ilvl w:val="0"/>
           <w:numId w:val="43"/>
         </w:numPr>
-        <w:rPr>
-          <w:lang w:val="en-DE"/>
-        </w:rPr>
-      </w:pPr>
-      <w:r>
-        <w:rPr>
-          <w:b/>
-          <w:bCs/>
-          <w:lang w:val="en-DE"/>
+      </w:pPr>
+      <w:r>
+        <w:rPr>
+          <w:b/>
+          <w:bCs/>
         </w:rPr>
         <w:t>Action:</w:t>
       </w:r>
       <w:r>
-        <w:rPr>
-          <w:lang w:val="en-DE"/>
-        </w:rPr>
         <w:t> Help secure the protocol by discovering and responsibly reporting vulnerabilities.</w:t>
       </w:r>
     </w:p>
@@ -5083,35 +4898,20 @@
           <w:ilvl w:val="0"/>
           <w:numId w:val="43"/>
         </w:numPr>
-        <w:rPr>
-          <w:lang w:val="en-DE"/>
-        </w:rPr>
-      </w:pPr>
-      <w:r>
-        <w:rPr>
-          <w:b/>
-          <w:bCs/>
-          <w:lang w:val="en-DE"/>
+      </w:pPr>
+      <w:r>
+        <w:rPr>
+          <w:b/>
+          <w:bCs/>
         </w:rPr>
         <w:t>Reward:</w:t>
       </w:r>
       <w:r>
-        <w:rPr>
-          <w:lang w:val="en-DE"/>
-        </w:rPr>
         <w:t> This is a separate, high-impact category. Finding a single critical bug will earn a massive point bonus, worth more than all other categories combined, to highly incentivize security researchers.</w:t>
       </w:r>
     </w:p>
     <w:p>
-      <w:pPr>
-        <w:rPr>
-          <w:lang w:val="en-DE"/>
-        </w:rPr>
-      </w:pPr>
-      <w:r>
-        <w:rPr>
-          <w:lang w:val="en-DE"/>
-        </w:rPr>
+      <w:r>
         <w:t>This multi-faceted system is designed to be bot-resistant and to ensure that the initial decentralization of the DAO is placed firmly in the hands of its most valuable and committed founding players, strategists, and guardians.</w:t>
       </w:r>
     </w:p>
@@ -5120,7 +4920,6 @@
         <w:rPr>
           <w:b/>
           <w:bCs/>
-          <w:lang w:val="en-DE"/>
         </w:rPr>
       </w:pPr>
     </w:p>
@@ -5165,15 +4964,7 @@
         <w:t>2. Deep Community Ownership Over Time:</w:t>
       </w:r>
       <w:r>
-        <w:t xml:space="preserve"> It is crucial to understand that the initial 5% public sale is not the full extent of community ownership. Our </w:t>
-      </w:r>
-      <w:proofErr w:type="spellStart"/>
-      <w:r>
-        <w:t>tokenomics</w:t>
-      </w:r>
-      <w:proofErr w:type="spellEnd"/>
-      <w:r>
-        <w:t xml:space="preserve"> are structured so that </w:t>
+        <w:t> It is crucial to understand that the initial 5% public sale is not the full extent of community ownership. Our tokenomics are structured so that </w:t>
       </w:r>
       <w:r>
         <w:rPr>
@@ -5228,15 +5019,7 @@
     </w:p>
     <w:p>
       <w:r>
-        <w:t xml:space="preserve">In short, our distribution model prioritizes sustainable growth over short-term hype. We are building an ecosystem that is meant to last, and our </w:t>
-      </w:r>
-      <w:proofErr w:type="spellStart"/>
-      <w:r>
-        <w:t>tokenomics</w:t>
-      </w:r>
-      <w:proofErr w:type="spellEnd"/>
-      <w:r>
-        <w:t xml:space="preserve"> reflect that core commitment.</w:t>
+        <w:t>In short, our distribution model prioritizes sustainable growth over short-term hype. We are building an ecosystem that is meant to last, and our tokenomics reflect that core commitment.</w:t>
       </w:r>
     </w:p>
     <w:p/>
@@ -5266,7 +5049,7 @@
           <w:b w:val="0"/>
         </w:rPr>
       </w:pPr>
-      <w:bookmarkStart w:id="15" w:name="_Toc206418592"/>
+      <w:bookmarkStart w:id="15" w:name="_Toc216525217"/>
       <w:r>
         <w:lastRenderedPageBreak/>
         <w:t>Roadmap &amp; Future Vision</w:t>
@@ -5309,15 +5092,7 @@
         </w:numPr>
       </w:pPr>
       <w:r>
-        <w:t xml:space="preserve">Phase 3 (Q1 202Y): Dual Independent Security Audits, Public </w:t>
-      </w:r>
-      <w:proofErr w:type="spellStart"/>
-      <w:r>
-        <w:t>Testnet</w:t>
-      </w:r>
-      <w:proofErr w:type="spellEnd"/>
-      <w:r>
-        <w:t xml:space="preserve"> Launch on Base, Community Building Campaign.</w:t>
+        <w:t>Phase 3 (Q1 202Y): Dual Independent Security Audits, Public Testnet Launch on Base, Community Building Campaign.</w:t>
       </w:r>
     </w:p>
     <w:p>
@@ -5360,39 +5135,7 @@
         </w:numPr>
       </w:pPr>
       <w:r>
-        <w:t>The "Volatile Asset" Game Mode: Instead of minting $FIM with stablecoins, players would mint Fake Internet Coins (</w:t>
-      </w:r>
-      <w:proofErr w:type="spellStart"/>
-      <w:r>
-        <w:t>FICs</w:t>
-      </w:r>
-      <w:proofErr w:type="spellEnd"/>
-      <w:r>
-        <w:t>) by depositing real, volatile assets (e.g., minting $</w:t>
-      </w:r>
-      <w:proofErr w:type="spellStart"/>
-      <w:r>
-        <w:t>FICeth</w:t>
-      </w:r>
-      <w:proofErr w:type="spellEnd"/>
-      <w:r>
-        <w:t> with ETH, $</w:t>
-      </w:r>
-      <w:proofErr w:type="spellStart"/>
-      <w:r>
-        <w:t>FICbtc</w:t>
-      </w:r>
-      <w:proofErr w:type="spellEnd"/>
-      <w:r>
-        <w:t> with WBTC, $</w:t>
-      </w:r>
-      <w:proofErr w:type="spellStart"/>
-      <w:r>
-        <w:t>FICdoge</w:t>
-      </w:r>
-      <w:proofErr w:type="spellEnd"/>
-      <w:r>
-        <w:t> with DOGE). This introduces a profound new layer of complexity: the Gini Coefficient would constantly shift not just from player trading, but from the real-world price movements of the underlying collateral. This mode would test a faction's ability to manage a truly chaotic, multi-variable economy.</w:t>
+        <w:t>The "Volatile Asset" Game Mode: Instead of minting $FIM with stablecoins, players would mint Fake Internet Coins (FICs) by depositing real, volatile assets (e.g., minting $FICeth with ETH, $FICbtc with WBTC, $FICdoge with DOGE). This introduces a profound new layer of complexity: the Gini Coefficient would constantly shift not just from player trading, but from the real-world price movements of the underlying collateral. This mode would test a faction's ability to manage a truly chaotic, multi-variable economy.</w:t>
       </w:r>
     </w:p>
     <w:p>
@@ -5433,7 +5176,7 @@
           <w:b w:val="0"/>
         </w:rPr>
       </w:pPr>
-      <w:bookmarkStart w:id="17" w:name="_Toc206418593"/>
+      <w:bookmarkStart w:id="17" w:name="_Toc216525218"/>
       <w:r>
         <w:lastRenderedPageBreak/>
         <w:t>Community Growth &amp; Go-to-Market Strategy</w:t>
@@ -5498,15 +5241,7 @@
         <w:t>Community Engagement:</w:t>
       </w:r>
       <w:r>
-        <w:t xml:space="preserve"> Hosting AMAs and participating in discussions within DeFi, strategy gaming, and DAO-focused communities on Discord, Telegram, and </w:t>
-      </w:r>
-      <w:proofErr w:type="spellStart"/>
-      <w:r>
-        <w:t>Farcaster</w:t>
-      </w:r>
-      <w:proofErr w:type="spellEnd"/>
-      <w:r>
-        <w:t>.</w:t>
+        <w:t> Hosting AMAs and participating in discussions within DeFi, strategy gaming, and DAO-focused communities on Discord, Telegram, and Farcaster.</w:t>
       </w:r>
     </w:p>
     <w:p>
@@ -5561,23 +5296,7 @@
         <w:t>Targeted Airdrop:</w:t>
       </w:r>
       <w:r>
-        <w:t xml:space="preserve"> A portion of the initial supply will be airdropped to engaged </w:t>
-      </w:r>
-      <w:proofErr w:type="spellStart"/>
-      <w:r>
-        <w:t>testnet</w:t>
-      </w:r>
-      <w:proofErr w:type="spellEnd"/>
-      <w:r>
-        <w:t xml:space="preserve"> participants and wallets that have demonstrated activity in adjacent protocols (e.g., prediction markets, other gaming </w:t>
-      </w:r>
-      <w:proofErr w:type="spellStart"/>
-      <w:r>
-        <w:t>DAOs</w:t>
-      </w:r>
-      <w:proofErr w:type="spellEnd"/>
-      <w:r>
-        <w:t>).</w:t>
+        <w:t> A portion of the initial supply will be airdropped to engaged testnet participants and wallets that have demonstrated activity in adjacent protocols (e.g., prediction markets, other gaming DAOs).</w:t>
       </w:r>
     </w:p>
     <w:p>
@@ -5758,7 +5477,7 @@
         </w:rPr>
       </w:pPr>
       <w:bookmarkStart w:id="19" w:name="_Toc205927087"/>
-      <w:bookmarkStart w:id="20" w:name="_Toc206418594"/>
+      <w:bookmarkStart w:id="20" w:name="_Toc216525219"/>
       <w:bookmarkEnd w:id="18"/>
       <w:r>
         <w:rPr>
@@ -5933,7 +5652,6 @@
               </w:rPr>
               <w:t>Our "</w:t>
             </w:r>
-            <w:proofErr w:type="spellStart"/>
             <w:r>
               <w:rPr>
                 <w:rFonts w:asciiTheme="majorHAnsi" w:eastAsiaTheme="majorEastAsia" w:hAnsiTheme="majorHAnsi" w:cstheme="majorBidi"/>
@@ -5941,17 +5659,7 @@
                 <w:bCs/>
                 <w:color w:val="000000" w:themeColor="text1"/>
               </w:rPr>
-              <w:t>Defense</w:t>
-            </w:r>
-            <w:proofErr w:type="spellEnd"/>
-            <w:r>
-              <w:rPr>
-                <w:rFonts w:asciiTheme="majorHAnsi" w:eastAsiaTheme="majorEastAsia" w:hAnsiTheme="majorHAnsi" w:cstheme="majorBidi"/>
-                <w:b/>
-                <w:bCs/>
-                <w:color w:val="000000" w:themeColor="text1"/>
-              </w:rPr>
-              <w:t>-in-Depth</w:t>
+              <w:t>Defense-in-Depth</w:t>
             </w:r>
             <w:r>
               <w:rPr>
@@ -6252,7 +5960,7 @@
           <w:b w:val="0"/>
         </w:rPr>
       </w:pPr>
-      <w:bookmarkStart w:id="22" w:name="_Toc206418595"/>
+      <w:bookmarkStart w:id="22" w:name="_Toc216525220"/>
       <w:r>
         <w:lastRenderedPageBreak/>
         <w:t>Core Contributors</w:t>
@@ -6294,7 +6002,7 @@
           <w:b w:val="0"/>
         </w:rPr>
       </w:pPr>
-      <w:bookmarkStart w:id="24" w:name="_Toc206418596"/>
+      <w:bookmarkStart w:id="24" w:name="_Toc216525221"/>
       <w:r>
         <w:lastRenderedPageBreak/>
         <w:t>Join the Game</w:t>
@@ -6315,7 +6023,19 @@
         </w:numPr>
       </w:pPr>
       <w:r>
-        <w:t>Follow our journey on Twitter: [Link to your Twitter]</w:t>
+        <w:t xml:space="preserve">Follow our journey on </w:t>
+      </w:r>
+      <w:r>
+        <w:t>Bluesky</w:t>
+      </w:r>
+      <w:r>
+        <w:t xml:space="preserve">: [Link to your </w:t>
+      </w:r>
+      <w:r>
+        <w:t>Bluesky</w:t>
+      </w:r>
+      <w:r>
+        <w:t>]</w:t>
       </w:r>
     </w:p>
     <w:p>
@@ -6330,35 +6050,8 @@
       </w:r>
     </w:p>
     <w:p>
-      <w:pPr>
-        <w:numPr>
-          <w:ilvl w:val="0"/>
-          <w:numId w:val="30"/>
-        </w:numPr>
-      </w:pPr>
-      <w:r>
-        <w:t xml:space="preserve">Read our in-depth articles on Mirror: [Link to your </w:t>
-      </w:r>
-      <w:proofErr w:type="spellStart"/>
-      <w:r>
-        <w:t>Mirror.xyz</w:t>
-      </w:r>
-      <w:proofErr w:type="spellEnd"/>
-      <w:r>
-        <w:t xml:space="preserve"> blog]</w:t>
-      </w:r>
-    </w:p>
-    <w:p>
-      <w:r>
-        <w:t xml:space="preserve">Prepare for our upcoming </w:t>
-      </w:r>
-      <w:proofErr w:type="spellStart"/>
-      <w:r>
-        <w:t>Testnet</w:t>
-      </w:r>
-      <w:proofErr w:type="spellEnd"/>
-      <w:r>
-        <w:t xml:space="preserve"> on the Base network. The first players and most active contributors will be rewarded.</w:t>
+      <w:r>
+        <w:t>Prepare for our upcoming Testnet on the Base network. The first players and most active contributors will be rewarded.</w:t>
       </w:r>
     </w:p>
     <w:p>
@@ -6447,16 +6140,12 @@
           <w:jc w:val="right"/>
         </w:pPr>
         <w:hyperlink r:id="rId1" w:history="1">
-          <w:proofErr w:type="spellStart"/>
-          <w:proofErr w:type="gramStart"/>
           <w:r>
             <w:rPr>
               <w:rStyle w:val="Hyperlink"/>
             </w:rPr>
             <w:t>ritardo.games</w:t>
           </w:r>
-          <w:proofErr w:type="spellEnd"/>
-          <w:proofErr w:type="gramEnd"/>
         </w:hyperlink>
         <w:r>
           <w:t xml:space="preserve"> | </w:t>
@@ -8632,6 +8321,155 @@
     </w:lvl>
   </w:abstractNum>
   <w:abstractNum w:abstractNumId="14" w15:restartNumberingAfterBreak="0">
+    <w:nsid w:val="23551BF8"/>
+    <w:multiLevelType w:val="multilevel"/>
+    <w:tmpl w:val="628E38A8"/>
+    <w:lvl w:ilvl="0">
+      <w:start w:val="1"/>
+      <w:numFmt w:val="bullet"/>
+      <w:lvlText w:val=""/>
+      <w:lvlJc w:val="left"/>
+      <w:pPr>
+        <w:tabs>
+          <w:tab w:val="num" w:pos="720"/>
+        </w:tabs>
+        <w:ind w:left="720" w:hanging="360"/>
+      </w:pPr>
+      <w:rPr>
+        <w:rFonts w:ascii="Symbol" w:hAnsi="Symbol" w:hint="default"/>
+        <w:sz w:val="20"/>
+      </w:rPr>
+    </w:lvl>
+    <w:lvl w:ilvl="1">
+      <w:start w:val="1"/>
+      <w:numFmt w:val="bullet"/>
+      <w:lvlText w:val="o"/>
+      <w:lvlJc w:val="left"/>
+      <w:pPr>
+        <w:tabs>
+          <w:tab w:val="num" w:pos="1440"/>
+        </w:tabs>
+        <w:ind w:left="1440" w:hanging="360"/>
+      </w:pPr>
+      <w:rPr>
+        <w:rFonts w:ascii="Courier New" w:hAnsi="Courier New" w:hint="default"/>
+        <w:sz w:val="20"/>
+      </w:rPr>
+    </w:lvl>
+    <w:lvl w:ilvl="2" w:tentative="1">
+      <w:start w:val="1"/>
+      <w:numFmt w:val="bullet"/>
+      <w:lvlText w:val=""/>
+      <w:lvlJc w:val="left"/>
+      <w:pPr>
+        <w:tabs>
+          <w:tab w:val="num" w:pos="2160"/>
+        </w:tabs>
+        <w:ind w:left="2160" w:hanging="360"/>
+      </w:pPr>
+      <w:rPr>
+        <w:rFonts w:ascii="Wingdings" w:hAnsi="Wingdings" w:hint="default"/>
+        <w:sz w:val="20"/>
+      </w:rPr>
+    </w:lvl>
+    <w:lvl w:ilvl="3" w:tentative="1">
+      <w:start w:val="1"/>
+      <w:numFmt w:val="bullet"/>
+      <w:lvlText w:val=""/>
+      <w:lvlJc w:val="left"/>
+      <w:pPr>
+        <w:tabs>
+          <w:tab w:val="num" w:pos="2880"/>
+        </w:tabs>
+        <w:ind w:left="2880" w:hanging="360"/>
+      </w:pPr>
+      <w:rPr>
+        <w:rFonts w:ascii="Wingdings" w:hAnsi="Wingdings" w:hint="default"/>
+        <w:sz w:val="20"/>
+      </w:rPr>
+    </w:lvl>
+    <w:lvl w:ilvl="4" w:tentative="1">
+      <w:start w:val="1"/>
+      <w:numFmt w:val="bullet"/>
+      <w:lvlText w:val=""/>
+      <w:lvlJc w:val="left"/>
+      <w:pPr>
+        <w:tabs>
+          <w:tab w:val="num" w:pos="3600"/>
+        </w:tabs>
+        <w:ind w:left="3600" w:hanging="360"/>
+      </w:pPr>
+      <w:rPr>
+        <w:rFonts w:ascii="Wingdings" w:hAnsi="Wingdings" w:hint="default"/>
+        <w:sz w:val="20"/>
+      </w:rPr>
+    </w:lvl>
+    <w:lvl w:ilvl="5" w:tentative="1">
+      <w:start w:val="1"/>
+      <w:numFmt w:val="bullet"/>
+      <w:lvlText w:val=""/>
+      <w:lvlJc w:val="left"/>
+      <w:pPr>
+        <w:tabs>
+          <w:tab w:val="num" w:pos="4320"/>
+        </w:tabs>
+        <w:ind w:left="4320" w:hanging="360"/>
+      </w:pPr>
+      <w:rPr>
+        <w:rFonts w:ascii="Wingdings" w:hAnsi="Wingdings" w:hint="default"/>
+        <w:sz w:val="20"/>
+      </w:rPr>
+    </w:lvl>
+    <w:lvl w:ilvl="6" w:tentative="1">
+      <w:start w:val="1"/>
+      <w:numFmt w:val="bullet"/>
+      <w:lvlText w:val=""/>
+      <w:lvlJc w:val="left"/>
+      <w:pPr>
+        <w:tabs>
+          <w:tab w:val="num" w:pos="5040"/>
+        </w:tabs>
+        <w:ind w:left="5040" w:hanging="360"/>
+      </w:pPr>
+      <w:rPr>
+        <w:rFonts w:ascii="Wingdings" w:hAnsi="Wingdings" w:hint="default"/>
+        <w:sz w:val="20"/>
+      </w:rPr>
+    </w:lvl>
+    <w:lvl w:ilvl="7" w:tentative="1">
+      <w:start w:val="1"/>
+      <w:numFmt w:val="bullet"/>
+      <w:lvlText w:val=""/>
+      <w:lvlJc w:val="left"/>
+      <w:pPr>
+        <w:tabs>
+          <w:tab w:val="num" w:pos="5760"/>
+        </w:tabs>
+        <w:ind w:left="5760" w:hanging="360"/>
+      </w:pPr>
+      <w:rPr>
+        <w:rFonts w:ascii="Wingdings" w:hAnsi="Wingdings" w:hint="default"/>
+        <w:sz w:val="20"/>
+      </w:rPr>
+    </w:lvl>
+    <w:lvl w:ilvl="8" w:tentative="1">
+      <w:start w:val="1"/>
+      <w:numFmt w:val="bullet"/>
+      <w:lvlText w:val=""/>
+      <w:lvlJc w:val="left"/>
+      <w:pPr>
+        <w:tabs>
+          <w:tab w:val="num" w:pos="6480"/>
+        </w:tabs>
+        <w:ind w:left="6480" w:hanging="360"/>
+      </w:pPr>
+      <w:rPr>
+        <w:rFonts w:ascii="Wingdings" w:hAnsi="Wingdings" w:hint="default"/>
+        <w:sz w:val="20"/>
+      </w:rPr>
+    </w:lvl>
+  </w:abstractNum>
+  <w:abstractNum w:abstractNumId="15" w15:restartNumberingAfterBreak="0">
     <w:nsid w:val="2DD32A7A"/>
     <w:multiLevelType w:val="multilevel"/>
     <w:tmpl w:val="6DB2E89E"/>
@@ -8780,7 +8618,7 @@
       </w:rPr>
     </w:lvl>
   </w:abstractNum>
-  <w:abstractNum w:abstractNumId="15" w15:restartNumberingAfterBreak="0">
+  <w:abstractNum w:abstractNumId="16" w15:restartNumberingAfterBreak="0">
     <w:nsid w:val="35B80EED"/>
     <w:multiLevelType w:val="multilevel"/>
     <w:tmpl w:val="893A1FAA"/>
@@ -8929,7 +8767,7 @@
       </w:rPr>
     </w:lvl>
   </w:abstractNum>
-  <w:abstractNum w:abstractNumId="16" w15:restartNumberingAfterBreak="0">
+  <w:abstractNum w:abstractNumId="17" w15:restartNumberingAfterBreak="0">
     <w:nsid w:val="36DF3D76"/>
     <w:multiLevelType w:val="multilevel"/>
     <w:tmpl w:val="22FC9238"/>
@@ -9074,7 +8912,7 @@
       </w:rPr>
     </w:lvl>
   </w:abstractNum>
-  <w:abstractNum w:abstractNumId="17" w15:restartNumberingAfterBreak="0">
+  <w:abstractNum w:abstractNumId="18" w15:restartNumberingAfterBreak="0">
     <w:nsid w:val="377F4E25"/>
     <w:multiLevelType w:val="hybridMultilevel"/>
     <w:tmpl w:val="0EB0C74E"/>
@@ -9164,7 +9002,7 @@
       </w:pPr>
     </w:lvl>
   </w:abstractNum>
-  <w:abstractNum w:abstractNumId="18" w15:restartNumberingAfterBreak="0">
+  <w:abstractNum w:abstractNumId="19" w15:restartNumberingAfterBreak="0">
     <w:nsid w:val="3B572AEC"/>
     <w:multiLevelType w:val="multilevel"/>
     <w:tmpl w:val="CE6CA1D2"/>
@@ -9313,7 +9151,7 @@
       </w:rPr>
     </w:lvl>
   </w:abstractNum>
-  <w:abstractNum w:abstractNumId="19" w15:restartNumberingAfterBreak="0">
+  <w:abstractNum w:abstractNumId="20" w15:restartNumberingAfterBreak="0">
     <w:nsid w:val="408A2BD2"/>
     <w:multiLevelType w:val="multilevel"/>
     <w:tmpl w:val="AF142B3A"/>
@@ -9462,7 +9300,7 @@
       </w:rPr>
     </w:lvl>
   </w:abstractNum>
-  <w:abstractNum w:abstractNumId="20" w15:restartNumberingAfterBreak="0">
+  <w:abstractNum w:abstractNumId="21" w15:restartNumberingAfterBreak="0">
     <w:nsid w:val="409B4847"/>
     <w:multiLevelType w:val="multilevel"/>
     <w:tmpl w:val="FBC205B0"/>
@@ -9611,7 +9449,7 @@
       </w:rPr>
     </w:lvl>
   </w:abstractNum>
-  <w:abstractNum w:abstractNumId="21" w15:restartNumberingAfterBreak="0">
+  <w:abstractNum w:abstractNumId="22" w15:restartNumberingAfterBreak="0">
     <w:nsid w:val="45F17ACC"/>
     <w:multiLevelType w:val="multilevel"/>
     <w:tmpl w:val="78469CCC"/>
@@ -9760,7 +9598,7 @@
       </w:rPr>
     </w:lvl>
   </w:abstractNum>
-  <w:abstractNum w:abstractNumId="22" w15:restartNumberingAfterBreak="0">
+  <w:abstractNum w:abstractNumId="23" w15:restartNumberingAfterBreak="0">
     <w:nsid w:val="46B30C86"/>
     <w:multiLevelType w:val="multilevel"/>
     <w:tmpl w:val="21FE7006"/>
@@ -9909,7 +9747,7 @@
       </w:rPr>
     </w:lvl>
   </w:abstractNum>
-  <w:abstractNum w:abstractNumId="23" w15:restartNumberingAfterBreak="0">
+  <w:abstractNum w:abstractNumId="24" w15:restartNumberingAfterBreak="0">
     <w:nsid w:val="48C57C32"/>
     <w:multiLevelType w:val="multilevel"/>
     <w:tmpl w:val="B7B07996"/>
@@ -10058,7 +9896,7 @@
       </w:rPr>
     </w:lvl>
   </w:abstractNum>
-  <w:abstractNum w:abstractNumId="24" w15:restartNumberingAfterBreak="0">
+  <w:abstractNum w:abstractNumId="25" w15:restartNumberingAfterBreak="0">
     <w:nsid w:val="4A8A55BC"/>
     <w:multiLevelType w:val="multilevel"/>
     <w:tmpl w:val="A510C274"/>
@@ -10207,7 +10045,7 @@
       </w:rPr>
     </w:lvl>
   </w:abstractNum>
-  <w:abstractNum w:abstractNumId="25" w15:restartNumberingAfterBreak="0">
+  <w:abstractNum w:abstractNumId="26" w15:restartNumberingAfterBreak="0">
     <w:nsid w:val="4AA0202E"/>
     <w:multiLevelType w:val="multilevel"/>
     <w:tmpl w:val="5D10C8AC"/>
@@ -10356,7 +10194,7 @@
       </w:rPr>
     </w:lvl>
   </w:abstractNum>
-  <w:abstractNum w:abstractNumId="26" w15:restartNumberingAfterBreak="0">
+  <w:abstractNum w:abstractNumId="27" w15:restartNumberingAfterBreak="0">
     <w:nsid w:val="50087C09"/>
     <w:multiLevelType w:val="multilevel"/>
     <w:tmpl w:val="8E9676FA"/>
@@ -10505,7 +10343,7 @@
       </w:rPr>
     </w:lvl>
   </w:abstractNum>
-  <w:abstractNum w:abstractNumId="27" w15:restartNumberingAfterBreak="0">
+  <w:abstractNum w:abstractNumId="28" w15:restartNumberingAfterBreak="0">
     <w:nsid w:val="53646623"/>
     <w:multiLevelType w:val="multilevel"/>
     <w:tmpl w:val="347A9EC4"/>
@@ -10618,7 +10456,7 @@
       </w:pPr>
     </w:lvl>
   </w:abstractNum>
-  <w:abstractNum w:abstractNumId="28" w15:restartNumberingAfterBreak="0">
+  <w:abstractNum w:abstractNumId="29" w15:restartNumberingAfterBreak="0">
     <w:nsid w:val="5AA10CA1"/>
     <w:multiLevelType w:val="multilevel"/>
     <w:tmpl w:val="6D56D9E4"/>
@@ -10767,7 +10605,7 @@
       </w:rPr>
     </w:lvl>
   </w:abstractNum>
-  <w:abstractNum w:abstractNumId="29" w15:restartNumberingAfterBreak="0">
+  <w:abstractNum w:abstractNumId="30" w15:restartNumberingAfterBreak="0">
     <w:nsid w:val="5C3B1819"/>
     <w:multiLevelType w:val="multilevel"/>
     <w:tmpl w:val="573E42D6"/>
@@ -10916,7 +10754,7 @@
       </w:rPr>
     </w:lvl>
   </w:abstractNum>
-  <w:abstractNum w:abstractNumId="30" w15:restartNumberingAfterBreak="0">
+  <w:abstractNum w:abstractNumId="31" w15:restartNumberingAfterBreak="0">
     <w:nsid w:val="5DCE672B"/>
     <w:multiLevelType w:val="multilevel"/>
     <w:tmpl w:val="33662F62"/>
@@ -11065,7 +10903,7 @@
       </w:rPr>
     </w:lvl>
   </w:abstractNum>
-  <w:abstractNum w:abstractNumId="31" w15:restartNumberingAfterBreak="0">
+  <w:abstractNum w:abstractNumId="32" w15:restartNumberingAfterBreak="0">
     <w:nsid w:val="61A37E0E"/>
     <w:multiLevelType w:val="multilevel"/>
     <w:tmpl w:val="89F619BA"/>
@@ -11214,7 +11052,7 @@
       </w:rPr>
     </w:lvl>
   </w:abstractNum>
-  <w:abstractNum w:abstractNumId="32" w15:restartNumberingAfterBreak="0">
+  <w:abstractNum w:abstractNumId="33" w15:restartNumberingAfterBreak="0">
     <w:nsid w:val="62E949E2"/>
     <w:multiLevelType w:val="multilevel"/>
     <w:tmpl w:val="680CF5C6"/>
@@ -11363,7 +11201,7 @@
       </w:rPr>
     </w:lvl>
   </w:abstractNum>
-  <w:abstractNum w:abstractNumId="33" w15:restartNumberingAfterBreak="0">
+  <w:abstractNum w:abstractNumId="34" w15:restartNumberingAfterBreak="0">
     <w:nsid w:val="65675DE4"/>
     <w:multiLevelType w:val="multilevel"/>
     <w:tmpl w:val="8C063E36"/>
@@ -11512,7 +11350,7 @@
       </w:rPr>
     </w:lvl>
   </w:abstractNum>
-  <w:abstractNum w:abstractNumId="34" w15:restartNumberingAfterBreak="0">
+  <w:abstractNum w:abstractNumId="35" w15:restartNumberingAfterBreak="0">
     <w:nsid w:val="67504652"/>
     <w:multiLevelType w:val="hybridMultilevel"/>
     <w:tmpl w:val="1BD07068"/>
@@ -11598,7 +11436,7 @@
       </w:pPr>
     </w:lvl>
   </w:abstractNum>
-  <w:abstractNum w:abstractNumId="35" w15:restartNumberingAfterBreak="0">
+  <w:abstractNum w:abstractNumId="36" w15:restartNumberingAfterBreak="0">
     <w:nsid w:val="6C1700F2"/>
     <w:multiLevelType w:val="multilevel"/>
     <w:tmpl w:val="CA34BA1A"/>
@@ -11747,7 +11585,7 @@
       </w:rPr>
     </w:lvl>
   </w:abstractNum>
-  <w:abstractNum w:abstractNumId="36" w15:restartNumberingAfterBreak="0">
+  <w:abstractNum w:abstractNumId="37" w15:restartNumberingAfterBreak="0">
     <w:nsid w:val="6E7E18FC"/>
     <w:multiLevelType w:val="multilevel"/>
     <w:tmpl w:val="4D9240FA"/>
@@ -11896,7 +11734,7 @@
       </w:rPr>
     </w:lvl>
   </w:abstractNum>
-  <w:abstractNum w:abstractNumId="37" w15:restartNumberingAfterBreak="0">
+  <w:abstractNum w:abstractNumId="38" w15:restartNumberingAfterBreak="0">
     <w:nsid w:val="6F6F338C"/>
     <w:multiLevelType w:val="multilevel"/>
     <w:tmpl w:val="804419F2"/>
@@ -12045,7 +11883,7 @@
       </w:rPr>
     </w:lvl>
   </w:abstractNum>
-  <w:abstractNum w:abstractNumId="38" w15:restartNumberingAfterBreak="0">
+  <w:abstractNum w:abstractNumId="39" w15:restartNumberingAfterBreak="0">
     <w:nsid w:val="701A6929"/>
     <w:multiLevelType w:val="multilevel"/>
     <w:tmpl w:val="4322C9B0"/>
@@ -12194,7 +12032,7 @@
       </w:rPr>
     </w:lvl>
   </w:abstractNum>
-  <w:abstractNum w:abstractNumId="39" w15:restartNumberingAfterBreak="0">
+  <w:abstractNum w:abstractNumId="40" w15:restartNumberingAfterBreak="0">
     <w:nsid w:val="74EB3C0F"/>
     <w:multiLevelType w:val="multilevel"/>
     <w:tmpl w:val="B4C68614"/>
@@ -12343,7 +12181,7 @@
       </w:rPr>
     </w:lvl>
   </w:abstractNum>
-  <w:abstractNum w:abstractNumId="40" w15:restartNumberingAfterBreak="0">
+  <w:abstractNum w:abstractNumId="41" w15:restartNumberingAfterBreak="0">
     <w:nsid w:val="76E91FB3"/>
     <w:multiLevelType w:val="multilevel"/>
     <w:tmpl w:val="AA4CA698"/>
@@ -12492,7 +12330,7 @@
       </w:rPr>
     </w:lvl>
   </w:abstractNum>
-  <w:abstractNum w:abstractNumId="41" w15:restartNumberingAfterBreak="0">
+  <w:abstractNum w:abstractNumId="42" w15:restartNumberingAfterBreak="0">
     <w:nsid w:val="79F171F1"/>
     <w:multiLevelType w:val="multilevel"/>
     <w:tmpl w:val="FA3C621C"/>
@@ -12651,19 +12489,19 @@
     <w:abstractNumId w:val="10"/>
   </w:num>
   <w:num w:numId="4" w16cid:durableId="2091463282">
-    <w:abstractNumId w:val="23"/>
+    <w:abstractNumId w:val="24"/>
   </w:num>
   <w:num w:numId="5" w16cid:durableId="1636180735">
     <w:abstractNumId w:val="4"/>
   </w:num>
   <w:num w:numId="6" w16cid:durableId="282421069">
-    <w:abstractNumId w:val="25"/>
+    <w:abstractNumId w:val="26"/>
   </w:num>
   <w:num w:numId="7" w16cid:durableId="2076463795">
-    <w:abstractNumId w:val="26"/>
+    <w:abstractNumId w:val="27"/>
   </w:num>
   <w:num w:numId="8" w16cid:durableId="259408934">
-    <w:abstractNumId w:val="39"/>
+    <w:abstractNumId w:val="40"/>
   </w:num>
   <w:num w:numId="9" w16cid:durableId="1226378873">
     <w:abstractNumId w:val="13"/>
@@ -12682,28 +12520,28 @@
     <w:abstractNumId w:val="7"/>
   </w:num>
   <w:num w:numId="12" w16cid:durableId="1840152305">
-    <w:abstractNumId w:val="19"/>
+    <w:abstractNumId w:val="20"/>
   </w:num>
   <w:num w:numId="13" w16cid:durableId="963852690">
-    <w:abstractNumId w:val="24"/>
+    <w:abstractNumId w:val="25"/>
   </w:num>
   <w:num w:numId="14" w16cid:durableId="366876967">
-    <w:abstractNumId w:val="30"/>
+    <w:abstractNumId w:val="31"/>
   </w:num>
   <w:num w:numId="15" w16cid:durableId="1976878">
-    <w:abstractNumId w:val="15"/>
+    <w:abstractNumId w:val="16"/>
   </w:num>
   <w:num w:numId="16" w16cid:durableId="347341951">
-    <w:abstractNumId w:val="35"/>
+    <w:abstractNumId w:val="36"/>
   </w:num>
   <w:num w:numId="17" w16cid:durableId="174730376">
-    <w:abstractNumId w:val="16"/>
+    <w:abstractNumId w:val="17"/>
   </w:num>
   <w:num w:numId="18" w16cid:durableId="572204590">
     <w:abstractNumId w:val="11"/>
   </w:num>
   <w:num w:numId="19" w16cid:durableId="842665824">
-    <w:abstractNumId w:val="32"/>
+    <w:abstractNumId w:val="33"/>
   </w:num>
   <w:num w:numId="20" w16cid:durableId="529881770">
     <w:abstractNumId w:val="3"/>
@@ -12712,61 +12550,61 @@
     <w:abstractNumId w:val="0"/>
   </w:num>
   <w:num w:numId="22" w16cid:durableId="1993213557">
-    <w:abstractNumId w:val="38"/>
+    <w:abstractNumId w:val="39"/>
   </w:num>
   <w:num w:numId="23" w16cid:durableId="1304316451">
-    <w:abstractNumId w:val="37"/>
+    <w:abstractNumId w:val="38"/>
   </w:num>
   <w:num w:numId="24" w16cid:durableId="53241634">
     <w:abstractNumId w:val="6"/>
   </w:num>
   <w:num w:numId="25" w16cid:durableId="1938901936">
-    <w:abstractNumId w:val="21"/>
+    <w:abstractNumId w:val="22"/>
   </w:num>
   <w:num w:numId="26" w16cid:durableId="874347523">
-    <w:abstractNumId w:val="27"/>
+    <w:abstractNumId w:val="28"/>
   </w:num>
   <w:num w:numId="27" w16cid:durableId="155075910">
-    <w:abstractNumId w:val="36"/>
+    <w:abstractNumId w:val="37"/>
   </w:num>
   <w:num w:numId="28" w16cid:durableId="411590594">
-    <w:abstractNumId w:val="33"/>
+    <w:abstractNumId w:val="34"/>
   </w:num>
   <w:num w:numId="29" w16cid:durableId="1347831502">
-    <w:abstractNumId w:val="28"/>
+    <w:abstractNumId w:val="29"/>
   </w:num>
   <w:num w:numId="30" w16cid:durableId="1653410153">
-    <w:abstractNumId w:val="40"/>
+    <w:abstractNumId w:val="41"/>
   </w:num>
   <w:num w:numId="31" w16cid:durableId="1410038242">
-    <w:abstractNumId w:val="17"/>
+    <w:abstractNumId w:val="18"/>
   </w:num>
   <w:num w:numId="32" w16cid:durableId="139612234">
-    <w:abstractNumId w:val="34"/>
+    <w:abstractNumId w:val="35"/>
   </w:num>
   <w:num w:numId="33" w16cid:durableId="967394691">
-    <w:abstractNumId w:val="18"/>
+    <w:abstractNumId w:val="19"/>
   </w:num>
   <w:num w:numId="34" w16cid:durableId="787043302">
-    <w:abstractNumId w:val="41"/>
+    <w:abstractNumId w:val="42"/>
   </w:num>
   <w:num w:numId="35" w16cid:durableId="2094426580">
-    <w:abstractNumId w:val="22"/>
+    <w:abstractNumId w:val="23"/>
   </w:num>
   <w:num w:numId="36" w16cid:durableId="1187057081">
-    <w:abstractNumId w:val="29"/>
+    <w:abstractNumId w:val="30"/>
   </w:num>
   <w:num w:numId="37" w16cid:durableId="997222064">
     <w:abstractNumId w:val="8"/>
   </w:num>
   <w:num w:numId="38" w16cid:durableId="1489594862">
-    <w:abstractNumId w:val="20"/>
+    <w:abstractNumId w:val="21"/>
   </w:num>
   <w:num w:numId="39" w16cid:durableId="1979873629">
     <w:abstractNumId w:val="9"/>
   </w:num>
   <w:num w:numId="40" w16cid:durableId="567033796">
-    <w:abstractNumId w:val="31"/>
+    <w:abstractNumId w:val="32"/>
   </w:num>
   <w:num w:numId="41" w16cid:durableId="1950695254">
     <w:abstractNumId w:val="2"/>
@@ -12775,6 +12613,9 @@
     <w:abstractNumId w:val="5"/>
   </w:num>
   <w:num w:numId="43" w16cid:durableId="1449931979">
+    <w:abstractNumId w:val="15"/>
+  </w:num>
+  <w:num w:numId="44" w16cid:durableId="1906407645">
     <w:abstractNumId w:val="14"/>
   </w:num>
 </w:numbering>
@@ -13384,6 +13225,7 @@
   <w:style w:type="character" w:default="1" w:styleId="DefaultParagraphFont">
     <w:name w:val="Default Paragraph Font"/>
     <w:uiPriority w:val="1"/>
+    <w:semiHidden/>
     <w:unhideWhenUsed/>
   </w:style>
   <w:style w:type="table" w:default="1" w:styleId="TableNormal">

</xml_diff>